<commit_message>
fix: réparer le .docx de l'étude de précédents, illisible par Word
Le fichier était reconstruit en re-sérialisant word/document.xml avec
ElementTree, ce qui écrasait les déclarations de namespace : les éléments
perdaient leur préfixe (w:p devenait p) et w14 était renommé ns2, alors que
mc:Ignorable continuait de nommer les anciens préfixes. Word refusait le
document.

Le contenu est maintenant inséré par édition textuelle du XML d'origine, si
bien que chaque préfixe et chaque déclaration survivent, et l'archive est
recopiée depuis le gabarit — seul word/document.xml diffère, toutes les
autres parties sont identiques octet pour octet.

Corrige aussi les w14:paraId dupliqués sur les puces clonées : ils doivent
être uniques dans le document, sinon Word signale un fichier corrompu.

Co-Authored-By: RuFlo <ruv@ruv.net>
Claude-Session: https://claude.ai/code/session_019pKKhRZBAP6J6xFRx4hPr5
</commit_message>
<xml_diff>
--- a/docs/projet-cgm-phase1/Etude de precedents.docx
+++ b/docs/projet-cgm-phase1/Etude de precedents.docx
@@ -1,1395 +1,1384 @@
 
 <file path=word/document.xml><?xml version="1.0" encoding="utf-8"?>
-<document xmlns="http://schemas.openxmlformats.org/wordprocessingml/2006/main" xmlns:ns1="http://schemas.openxmlformats.org/markup-compatibility/2006" xmlns:ns2="http://schemas.microsoft.com/office/word/2010/wordml" ns1:Ignorable="w14 w15 w16se w16cid w16 w16cex w16sdtdh w16sdtfl w16du wp14">
-  <body>
-    <p ns2:paraId="35255A2A" ns2:textId="0D26D928" rsidR="0028214A" rsidRPr="00B5571C" rsidRDefault="00C969FD" rsidP="00C969FD">
-      <pPr>
-        <jc val="center"/>
-        <rPr>
-          <rFonts ascii="Arial Nova" hAnsi="Arial Nova" cs="Times New Roman"/>
-          <b/>
-          <sz val="24"/>
-          <szCs val="24"/>
-        </rPr>
-      </pPr>
-      <r rsidRPr="00B5571C">
-        <rPr>
-          <rFonts ascii="Arial Nova" hAnsi="Arial Nova" cs="Times New Roman"/>
-          <b/>
-          <sz val="24"/>
-          <szCs val="24"/>
-        </rPr>
-        <t>ÉTUDE DE PRÉCÉDENTS</t>
-      </r>
-    </p>
-    <p ns2:paraId="697444F9" ns2:textId="77777777" rsidR="002C3075" rsidRPr="00B5571C" rsidRDefault="002C3075" rsidP="00340C21">
-      <pPr>
-        <rPr>
-          <rFonts ascii="Arial Nova" hAnsi="Arial Nova" cs="Times New Roman"/>
-          <bCs/>
-          <sz val="28"/>
-          <szCs val="28"/>
-        </rPr>
-      </pPr>
-    </p>
-    <tbl>
-      <tblPr>
-        <tblStyle val="Grilledetableauclaire"/>
-        <tblW w="8647" type="dxa"/>
-        <tblBorders>
-          <top val="none" sz="0" space="0" color="auto"/>
-          <left val="none" sz="0" space="0" color="auto"/>
-          <bottom val="none" sz="0" space="0" color="auto"/>
-          <right val="none" sz="0" space="0" color="auto"/>
-          <insideH val="none" sz="0" space="0" color="auto"/>
-          <insideV val="none" sz="0" space="0" color="auto"/>
-        </tblBorders>
-        <tblLook val="04A0" firstRow="1" lastRow="0" firstColumn="1" lastColumn="0" noHBand="0" noVBand="1"/>
-      </tblPr>
-      <tblGrid>
-        <gridCol w="4081"/>
-        <gridCol w="4566"/>
-      </tblGrid>
-      <tr rsidR="00A34931" rsidRPr="00B5571C" ns2:paraId="23A8A88D" ns2:textId="77777777" rsidTr="00D36B15">
-        <tc>
-          <tcPr>
-            <tcW w="4081" type="dxa"/>
-          </tcPr>
-          <p ns2:paraId="66ABD3DA" ns2:textId="2A2A0D6F" rsidR="00A34931" rsidRPr="00B5571C" rsidRDefault="00E60FA6" rsidP="00AD2F9E">
-            <pPr>
-              <spacing after="120" line="276" lineRule="auto"/>
-              <rPr>
-                <rFonts ascii="Arial Nova" hAnsi="Arial Nova" cs="Times New Roman"/>
-                <bCs/>
-                <i/>
-                <iCs/>
-                <sz val="24"/>
-                <szCs val="24"/>
-              </rPr>
-            </pPr>
-            <r rsidRPr="00B5571C">
-              <rPr>
-                <rFonts ascii="Arial Nova" hAnsi="Arial Nova" cs="Times New Roman"/>
-                <bCs/>
-                <i/>
-                <iCs/>
-                <color val="A6A6A6" themeColor="background1" themeShade="A6"/>
-                <sz val="24"/>
-                <szCs val="24"/>
-              </rPr>
-              <t>Placer votre image #</t>
-            </r>
-            <r rsidR="00A52381" rsidRPr="00B5571C">
-              <rPr>
-                <rFonts ascii="Arial Nova" hAnsi="Arial Nova" cs="Times New Roman"/>
-                <bCs/>
-                <i/>
-                <iCs/>
-                <color val="A6A6A6" themeColor="background1" themeShade="A6"/>
-                <sz val="24"/>
-                <szCs val="24"/>
-              </rPr>
-              <t>1</t>
-            </r>
-            <r rsidRPr="00B5571C">
-              <rPr>
-                <rFonts ascii="Arial Nova" hAnsi="Arial Nova" cs="Times New Roman"/>
-                <bCs/>
-                <i/>
-                <iCs/>
-                <color val="A6A6A6" themeColor="background1" themeShade="A6"/>
-                <sz val="24"/>
-                <szCs val="24"/>
-              </rPr>
-              <t xml:space="preserve"> ici</t>
-            </r>
-          </p>
-        </tc>
-        <tc>
-          <tcPr>
-            <tcW w="4566" type="dxa"/>
-            <vAlign val="center"/>
-          </tcPr>
-          <p ns2:paraId="6643B63B" ns2:textId="77777777" rsidR="00A34931" rsidRPr="00BC37A7" rsidRDefault="00D36B15" rsidP="00D36B15">
-            <pPr>
-              <pStyle val="Paragraphedeliste"/>
-              <numPr>
-                <ilvl val="0"/>
-                <numId val="8"/>
-              </numPr>
-              <spacing after="120" line="480" lineRule="auto"/>
-              <ind left="346"/>
-              <rPr>
-                <rFonts ascii="Arial Nova" hAnsi="Arial Nova" cs="Times New Roman"/>
-                <bCs/>
-                <szCs val="22"/>
-                <highlight val="yellow"/>
-              </rPr>
-            </pPr>
-            <r rsidRPr="00BC37A7">
-              <rPr>
-                <rFonts ascii="Arial Nova" hAnsi="Arial Nova" cs="Times New Roman"/>
-                <bCs/>
-                <szCs val="22"/>
-              </rPr>
-              <t xml:space="preserve">Volume surélevé sur pilotis : empreinte au sol minimale, peu d’excavation</t>
-            </r>
-          </p>
-          <p ns2:paraId="5EF7AC1F" ns2:textId="77777777" rsidR="00D36B15" rsidRPr="00BC37A7" rsidRDefault="00D36B15" rsidP="00D36B15">
-            <pPr>
-              <pStyle val="Paragraphedeliste"/>
-              <numPr>
-                <ilvl val="0"/>
-                <numId val="8"/>
-              </numPr>
-              <spacing after="120" line="480" lineRule="auto"/>
-              <ind left="346"/>
-              <rPr>
-                <rFonts ascii="Arial Nova" hAnsi="Arial Nova" cs="Times New Roman"/>
-                <bCs/>
-                <szCs val="22"/>
-              </rPr>
-            </pPr>
-            <r rsidRPr="00BC37A7">
-              <rPr>
-                <rFonts ascii="Arial Nova" hAnsi="Arial Nova" cs="Times New Roman"/>
-                <bCs/>
-                <szCs val="22"/>
-              </rPr>
-              <t xml:space="preserve">Terrain boisé en pente conservé sous le bâtiment</t>
-            </r>
-          </p>
-          <p ns2:paraId="5EF7AC1F" ns2:textId="77777777" rsidR="00D36B15" rsidRPr="00BC37A7" rsidRDefault="00D36B15" rsidP="00D36B15">
-            <pPr>
-              <pStyle val="Paragraphedeliste"/>
-              <numPr>
-                <ilvl val="0"/>
-                <numId val="8"/>
-              </numPr>
-              <spacing after="120" line="480" lineRule="auto"/>
-              <ind left="346"/>
-              <rPr>
-                <rFonts ascii="Arial Nova" hAnsi="Arial Nova" cs="Times New Roman"/>
-                <bCs/>
-                <szCs val="22"/>
-              </rPr>
-            </pPr>
-            <r rsidRPr="00BC37A7">
-              <rPr>
-                <rFonts ascii="Arial Nova" hAnsi="Arial Nova" cs="Times New Roman"/>
-                <bCs/>
-                <szCs val="22"/>
-              </rPr>
-              <t xml:space="preserve">Espace couvert sous le plancher : abri et rangement extérieur</t>
-            </r>
-          </p>
-          <p ns2:paraId="5EF7AC1F" ns2:textId="77777777" rsidR="00D36B15" rsidRPr="00BC37A7" rsidRDefault="00D36B15" rsidP="00D36B15">
-            <pPr>
-              <pStyle val="Paragraphedeliste"/>
-              <numPr>
-                <ilvl val="0"/>
-                <numId val="8"/>
-              </numPr>
-              <spacing after="120" line="480" lineRule="auto"/>
-              <ind left="346"/>
-              <rPr>
-                <rFonts ascii="Arial Nova" hAnsi="Arial Nova" cs="Times New Roman"/>
-                <bCs/>
-                <szCs val="22"/>
-              </rPr>
-            </pPr>
-            <r rsidRPr="00BC37A7">
-              <rPr>
-                <rFonts ascii="Arial Nova" hAnsi="Arial Nova" cs="Times New Roman"/>
-                <bCs/>
-                <szCs val="22"/>
-              </rPr>
-              <t xml:space="preserve">Grande baie vitrée orientée au sud : gain solaire et cadrage du paysage</t>
-            </r>
-          </p>
-          <p ns2:paraId="5EF7AC1F" ns2:textId="77777777" rsidR="00D36B15" rsidRPr="00BC37A7" rsidRDefault="00D36B15" rsidP="00D36B15">
-            <pPr>
-              <pStyle val="Paragraphedeliste"/>
-              <numPr>
-                <ilvl val="0"/>
-                <numId val="8"/>
-              </numPr>
-              <spacing after="120" line="480" lineRule="auto"/>
-              <ind left="346"/>
-              <rPr>
-                <rFonts ascii="Arial Nova" hAnsi="Arial Nova" cs="Times New Roman"/>
-                <bCs/>
-                <szCs val="22"/>
-              </rPr>
-            </pPr>
-            <r rsidRPr="00BC37A7">
-              <rPr>
-                <rFonts ascii="Arial Nova" hAnsi="Arial Nova" cs="Times New Roman"/>
-                <bCs/>
-                <szCs val="22"/>
-              </rPr>
-              <t xml:space="preserve">Volumétrie épurée, sans décrochement inutile</t>
-            </r>
-          </p>
-        </tc>
-      </tr>
-      <tr rsidR="00206086" rsidRPr="00B5571C" ns2:paraId="5A5094C2" ns2:textId="77777777" rsidTr="0024126A">
-        <tc>
-          <tcPr>
-            <tcW w="8647" type="dxa"/>
-            <gridSpan val="2"/>
-            <tcBorders>
-              <bottom val="dotted" sz="4" space="0" color="auto"/>
-            </tcBorders>
-          </tcPr>
-          <p ns2:paraId="5BA4BF6D" ns2:textId="2AC11BD7" rsidR="00206086" rsidRPr="00B5571C" rsidRDefault="00C40934" rsidP="00D922A2">
-            <pPr>
-              <spacing after="120"/>
-              <rPr>
-                <rFonts ascii="Arial Nova" hAnsi="Arial Nova" cs="Times New Roman"/>
-                <bCs/>
-                <sz val="20"/>
-              </rPr>
-            </pPr>
-            <r rsidRPr="00B5571C">
-              <rPr>
-                <rFonts ascii="Arial Nova" hAnsi="Arial Nova" cs="Times New Roman"/>
-                <bCs/>
-                <sz val="20"/>
-              </rPr>
-              <t xml:space="preserve">Source : www.archdaily.com/1014890/residence-chez-leon-quinzhee-architecture</t>
-            </r>
-          </p>
-        </tc>
-      </tr>
-      <tr rsidR="0024126A" rsidRPr="00B5571C" ns2:paraId="0261857E" ns2:textId="77777777" rsidTr="0024126A">
-        <tc>
-          <tcPr>
-            <tcW w="8647" type="dxa"/>
-            <gridSpan val="2"/>
-            <tcBorders>
-              <top val="dotted" sz="4" space="0" color="auto"/>
-            </tcBorders>
-          </tcPr>
-          <p ns2:paraId="2992DE29" ns2:textId="77777777" rsidR="0024126A" rsidRPr="00B5571C" rsidRDefault="0024126A" rsidP="0024126A">
-            <pPr>
-              <spacing after="120" line="240" lineRule="auto"/>
-              <rPr>
-                <rFonts ascii="Arial Nova" hAnsi="Arial Nova" cs="Times New Roman"/>
-                <bCs/>
-                <sz val="20"/>
-              </rPr>
-            </pPr>
-          </p>
-        </tc>
-      </tr>
-      <tr rsidR="00650BB3" rsidRPr="00B5571C" ns2:paraId="64B54E12" ns2:textId="77777777" rsidTr="00477DCD">
-        <tc>
-          <tcPr>
-            <tcW w="4081" type="dxa"/>
-          </tcPr>
-          <p ns2:paraId="6067C059" ns2:textId="2D36304C" rsidR="00650BB3" rsidRPr="00B5571C" rsidRDefault="00650BB3" rsidP="00AD2F9E">
-            <pPr>
-              <spacing after="120" line="276" lineRule="auto"/>
-              <rPr>
-                <rFonts ascii="Arial Nova" hAnsi="Arial Nova" cs="Times New Roman"/>
-                <bCs/>
-                <sz val="24"/>
-                <szCs val="24"/>
-              </rPr>
-            </pPr>
-            <r rsidRPr="00B5571C">
-              <rPr>
-                <rFonts ascii="Arial Nova" hAnsi="Arial Nova" cs="Times New Roman"/>
-                <bCs/>
-                <i/>
-                <iCs/>
-                <color val="A6A6A6" themeColor="background1" themeShade="A6"/>
-                <sz val="24"/>
-                <szCs val="24"/>
-              </rPr>
-              <t>Placer votre image #</t>
-            </r>
-            <r rsidR="00A52381" rsidRPr="00B5571C">
-              <rPr>
-                <rFonts ascii="Arial Nova" hAnsi="Arial Nova" cs="Times New Roman"/>
-                <bCs/>
-                <i/>
-                <iCs/>
-                <color val="A6A6A6" themeColor="background1" themeShade="A6"/>
-                <sz val="24"/>
-                <szCs val="24"/>
-              </rPr>
-              <t>2</t>
-            </r>
-            <r rsidRPr="00B5571C">
-              <rPr>
-                <rFonts ascii="Arial Nova" hAnsi="Arial Nova" cs="Times New Roman"/>
-                <bCs/>
-                <i/>
-                <iCs/>
-                <color val="A6A6A6" themeColor="background1" themeShade="A6"/>
-                <sz val="24"/>
-                <szCs val="24"/>
-              </rPr>
-              <t xml:space="preserve"> ici</t>
-            </r>
-          </p>
-        </tc>
-        <tc>
-          <tcPr>
-            <tcW w="4566" type="dxa"/>
-            <vAlign val="center"/>
-          </tcPr>
-          <p ns2:paraId="3FD21121" ns2:textId="77777777" rsidR="00D922A2" rsidRPr="00BC37A7" rsidRDefault="00D922A2" rsidP="00D922A2">
-            <pPr>
-              <pStyle val="Paragraphedeliste"/>
-              <numPr>
-                <ilvl val="0"/>
-                <numId val="8"/>
-              </numPr>
-              <spacing after="120" line="480" lineRule="auto"/>
-              <ind left="346"/>
-              <rPr>
-                <rFonts ascii="Arial Nova" hAnsi="Arial Nova" cs="Times New Roman"/>
-                <bCs/>
-                <szCs val="22"/>
-                <highlight val="yellow"/>
-              </rPr>
-            </pPr>
-            <r rsidRPr="00BC37A7">
-              <rPr>
-                <rFonts ascii="Arial Nova" hAnsi="Arial Nova" cs="Times New Roman"/>
-                <bCs/>
-                <szCs val="22"/>
-              </rPr>
-              <t xml:space="preserve">Toiture à deux versants : silhouette simple, la neige se dégage seule</t>
-            </r>
-          </p>
-          <p ns2:paraId="78E7E425" ns2:textId="77777777" rsidR="00D922A2" rsidRPr="00BC37A7" rsidRDefault="00D922A2" rsidP="00D922A2">
-            <pPr>
-              <pStyle val="Paragraphedeliste"/>
-              <numPr>
-                <ilvl val="0"/>
-                <numId val="8"/>
-              </numPr>
-              <spacing after="120" line="480" lineRule="auto"/>
-              <ind left="346"/>
-              <rPr>
-                <rFonts ascii="Arial Nova" hAnsi="Arial Nova" cs="Times New Roman"/>
-                <bCs/>
-                <szCs val="22"/>
-              </rPr>
-            </pPr>
-            <r rsidRPr="00BC37A7">
-              <rPr>
-                <rFonts ascii="Arial Nova" hAnsi="Arial Nova" cs="Times New Roman"/>
-                <bCs/>
-                <szCs val="22"/>
-              </rPr>
-              <t xml:space="preserve">Revêtement d’acier profilé noir : entretien minimal, contraste avec le boisé</t>
-            </r>
-          </p>
-          <p ns2:paraId="78E7E425" ns2:textId="77777777" rsidR="00D922A2" rsidRPr="00BC37A7" rsidRDefault="00D922A2" rsidP="00D922A2">
-            <pPr>
-              <pStyle val="Paragraphedeliste"/>
-              <numPr>
-                <ilvl val="0"/>
-                <numId val="8"/>
-              </numPr>
-              <spacing after="120" line="480" lineRule="auto"/>
-              <ind left="346"/>
-              <rPr>
-                <rFonts ascii="Arial Nova" hAnsi="Arial Nova" cs="Times New Roman"/>
-                <bCs/>
-                <szCs val="22"/>
-              </rPr>
-            </pPr>
-            <r rsidRPr="00BC37A7">
-              <rPr>
-                <rFonts ascii="Arial Nova" hAnsi="Arial Nova" cs="Times New Roman"/>
-                <bCs/>
-                <szCs val="22"/>
-              </rPr>
-              <t xml:space="preserve">Terrasse de cèdre qui relie les volumes et prolonge l’aire de vie</t>
-            </r>
-          </p>
-          <p ns2:paraId="78E7E425" ns2:textId="77777777" rsidR="00D922A2" rsidRPr="00BC37A7" rsidRDefault="00D922A2" rsidP="00D922A2">
-            <pPr>
-              <pStyle val="Paragraphedeliste"/>
-              <numPr>
-                <ilvl val="0"/>
-                <numId val="8"/>
-              </numPr>
-              <spacing after="120" line="480" lineRule="auto"/>
-              <ind left="346"/>
-              <rPr>
-                <rFonts ascii="Arial Nova" hAnsi="Arial Nova" cs="Times New Roman"/>
-                <bCs/>
-                <szCs val="22"/>
-              </rPr>
-            </pPr>
-            <r rsidRPr="00BC37A7">
-              <rPr>
-                <rFonts ascii="Arial Nova" hAnsi="Arial Nova" cs="Times New Roman"/>
-                <bCs/>
-                <szCs val="22"/>
-              </rPr>
-              <t xml:space="preserve">Rapport plein/vide marqué : mur presque aveugle d’un côté, large ouverture de l’autre</t>
-            </r>
-          </p>
-          <p ns2:paraId="78E7E425" ns2:textId="77777777" rsidR="00D922A2" rsidRPr="00BC37A7" rsidRDefault="00D922A2" rsidP="00D922A2">
-            <pPr>
-              <pStyle val="Paragraphedeliste"/>
-              <numPr>
-                <ilvl val="0"/>
-                <numId val="8"/>
-              </numPr>
-              <spacing after="120" line="480" lineRule="auto"/>
-              <ind left="346"/>
-              <rPr>
-                <rFonts ascii="Arial Nova" hAnsi="Arial Nova" cs="Times New Roman"/>
-                <bCs/>
-                <szCs val="22"/>
-              </rPr>
-            </pPr>
-            <r rsidRPr="00BC37A7">
-              <rPr>
-                <rFonts ascii="Arial Nova" hAnsi="Arial Nova" cs="Times New Roman"/>
-                <bCs/>
-                <szCs val="22"/>
-              </rPr>
-              <t xml:space="preserve">Palette réduite à deux matériaux : métal sombre et bois clair</t>
-            </r>
-          </p>
-        </tc>
-      </tr>
-      <tr rsidR="00650BB3" rsidRPr="00B5571C" ns2:paraId="305F99F9" ns2:textId="77777777" rsidTr="0024126A">
-        <tc>
-          <tcPr>
-            <tcW w="8647" type="dxa"/>
-            <gridSpan val="2"/>
-            <tcBorders>
-              <bottom val="dotted" sz="4" space="0" color="auto"/>
-            </tcBorders>
-          </tcPr>
-          <p ns2:paraId="61FFE0CA" ns2:textId="643B1CCB" rsidR="00650BB3" rsidRPr="00B5571C" rsidRDefault="00650BB3" rsidP="00D922A2">
-            <pPr>
-              <spacing after="120"/>
-              <rPr>
-                <rFonts ascii="Arial Nova" hAnsi="Arial Nova" cs="Times New Roman"/>
-                <bCs/>
-                <sz val="20"/>
-              </rPr>
-            </pPr>
-            <r rsidRPr="00B5571C">
-              <rPr>
-                <rFonts ascii="Arial Nova" hAnsi="Arial Nova" cs="Times New Roman"/>
-                <bCs/>
-                <sz val="20"/>
-              </rPr>
-              <t xml:space="preserve">Source : www.archdaily.com/915980/grand-pic-chalet-appareil-architecture</t>
-            </r>
-          </p>
-        </tc>
-      </tr>
-      <tr rsidR="0024126A" rsidRPr="00B5571C" ns2:paraId="0EAAF4A5" ns2:textId="77777777" rsidTr="0024126A">
-        <tc>
-          <tcPr>
-            <tcW w="8647" type="dxa"/>
-            <gridSpan val="2"/>
-            <tcBorders>
-              <top val="dotted" sz="4" space="0" color="auto"/>
-            </tcBorders>
-          </tcPr>
-          <p ns2:paraId="6D52704C" ns2:textId="77777777" rsidR="0024126A" rsidRPr="00B5571C" rsidRDefault="0024126A" rsidP="0024126A">
-            <pPr>
-              <spacing after="120" line="240" lineRule="auto"/>
-              <rPr>
-                <rFonts ascii="Arial Nova" hAnsi="Arial Nova" cs="Times New Roman"/>
-                <bCs/>
-                <sz val="20"/>
-              </rPr>
-            </pPr>
-          </p>
-        </tc>
-      </tr>
-      <tr rsidR="00650BB3" rsidRPr="00B5571C" ns2:paraId="04D6181B" ns2:textId="77777777" rsidTr="00477DCD">
-        <tc>
-          <tcPr>
-            <tcW w="4081" type="dxa"/>
-          </tcPr>
-          <p ns2:paraId="5EA2B135" ns2:textId="589A98A0" rsidR="00650BB3" rsidRPr="00B5571C" rsidRDefault="00650BB3" rsidP="00AD2F9E">
-            <pPr>
-              <spacing after="120" line="276" lineRule="auto"/>
-              <rPr>
-                <rFonts ascii="Arial Nova" hAnsi="Arial Nova" cs="Times New Roman"/>
-                <bCs/>
-                <sz val="24"/>
-                <szCs val="24"/>
-              </rPr>
-            </pPr>
-            <r rsidRPr="00B5571C">
-              <rPr>
-                <rFonts ascii="Arial Nova" hAnsi="Arial Nova" cs="Times New Roman"/>
-                <bCs/>
-                <i/>
-                <iCs/>
-                <color val="A6A6A6" themeColor="background1" themeShade="A6"/>
-                <sz val="24"/>
-                <szCs val="24"/>
-              </rPr>
-              <t>Placer votre image #</t>
-            </r>
-            <r rsidR="00A52381" rsidRPr="00B5571C">
-              <rPr>
-                <rFonts ascii="Arial Nova" hAnsi="Arial Nova" cs="Times New Roman"/>
-                <bCs/>
-                <i/>
-                <iCs/>
-                <color val="A6A6A6" themeColor="background1" themeShade="A6"/>
-                <sz val="24"/>
-                <szCs val="24"/>
-              </rPr>
-              <t>3</t>
-            </r>
-            <r rsidRPr="00B5571C">
-              <rPr>
-                <rFonts ascii="Arial Nova" hAnsi="Arial Nova" cs="Times New Roman"/>
-                <bCs/>
-                <i/>
-                <iCs/>
-                <color val="A6A6A6" themeColor="background1" themeShade="A6"/>
-                <sz val="24"/>
-                <szCs val="24"/>
-              </rPr>
-              <t xml:space="preserve"> ici</t>
-            </r>
-          </p>
-        </tc>
-        <tc>
-          <tcPr>
-            <tcW w="4566" type="dxa"/>
-            <vAlign val="center"/>
-          </tcPr>
-          <p ns2:paraId="773FD326" ns2:textId="77777777" rsidR="00D922A2" rsidRPr="00BC37A7" rsidRDefault="00D922A2" rsidP="00D922A2">
-            <pPr>
-              <pStyle val="Paragraphedeliste"/>
-              <numPr>
-                <ilvl val="0"/>
-                <numId val="8"/>
-              </numPr>
-              <spacing after="120" line="480" lineRule="auto"/>
-              <ind left="346"/>
-              <rPr>
-                <rFonts ascii="Arial Nova" hAnsi="Arial Nova" cs="Times New Roman"/>
-                <bCs/>
-                <szCs val="22"/>
-                <highlight val="yellow"/>
-              </rPr>
-            </pPr>
-            <r rsidRPr="00BC37A7">
-              <rPr>
-                <rFonts ascii="Arial Nova" hAnsi="Arial Nova" cs="Times New Roman"/>
-                <bCs/>
-                <szCs val="22"/>
-              </rPr>
-              <t xml:space="preserve">Micro-refuge quatre saisons : plan compact d’une seule pièce</t>
-            </r>
-          </p>
-          <p ns2:paraId="66944167" ns2:textId="77777777" rsidR="00D922A2" rsidRPr="00BC37A7" rsidRDefault="00D922A2" rsidP="00D922A2">
-            <pPr>
-              <pStyle val="Paragraphedeliste"/>
-              <numPr>
-                <ilvl val="0"/>
-                <numId val="8"/>
-              </numPr>
-              <spacing after="120" line="480" lineRule="auto"/>
-              <ind left="346"/>
-              <rPr>
-                <rFonts ascii="Arial Nova" hAnsi="Arial Nova" cs="Times New Roman"/>
-                <bCs/>
-                <szCs val="22"/>
-              </rPr>
-            </pPr>
-            <r rsidRPr="00BC37A7">
-              <rPr>
-                <rFonts ascii="Arial Nova" hAnsi="Arial Nova" cs="Times New Roman"/>
-                <bCs/>
-                <szCs val="22"/>
-              </rPr>
-              <t xml:space="preserve">Toiture à très forte pente : la neige glisse d’elle-même</t>
-            </r>
-          </p>
-          <p ns2:paraId="66944167" ns2:textId="77777777" rsidR="00D922A2" rsidRPr="00BC37A7" rsidRDefault="00D922A2" rsidP="00D922A2">
-            <pPr>
-              <pStyle val="Paragraphedeliste"/>
-              <numPr>
-                <ilvl val="0"/>
-                <numId val="8"/>
-              </numPr>
-              <spacing after="120" line="480" lineRule="auto"/>
-              <ind left="346"/>
-              <rPr>
-                <rFonts ascii="Arial Nova" hAnsi="Arial Nova" cs="Times New Roman"/>
-                <bCs/>
-                <szCs val="22"/>
-              </rPr>
-            </pPr>
-            <r rsidRPr="00BC37A7">
-              <rPr>
-                <rFonts ascii="Arial Nova" hAnsi="Arial Nova" cs="Times New Roman"/>
-                <bCs/>
-                <szCs val="22"/>
-              </rPr>
-              <t xml:space="preserve">Implantation dispersée le long d’un sentier, dans le couvert forestier</t>
-            </r>
-          </p>
-          <p ns2:paraId="66944167" ns2:textId="77777777" rsidR="00D922A2" rsidRPr="00BC37A7" rsidRDefault="00D922A2" rsidP="00D922A2">
-            <pPr>
-              <pStyle val="Paragraphedeliste"/>
-              <numPr>
-                <ilvl val="0"/>
-                <numId val="8"/>
-              </numPr>
-              <spacing after="120" line="480" lineRule="auto"/>
-              <ind left="346"/>
-              <rPr>
-                <rFonts ascii="Arial Nova" hAnsi="Arial Nova" cs="Times New Roman"/>
-                <bCs/>
-                <szCs val="22"/>
-              </rPr>
-            </pPr>
-            <r rsidRPr="00BC37A7">
-              <rPr>
-                <rFonts ascii="Arial Nova" hAnsi="Arial Nova" cs="Times New Roman"/>
-                <bCs/>
-                <szCs val="22"/>
-              </rPr>
-              <t xml:space="preserve">Ouverture concentrée sur un seul mur pignon, entièrement vitré vers le paysage</t>
-            </r>
-          </p>
-          <p ns2:paraId="66944167" ns2:textId="77777777" rsidR="00D922A2" rsidRPr="00BC37A7" rsidRDefault="00D922A2" rsidP="00D922A2">
-            <pPr>
-              <pStyle val="Paragraphedeliste"/>
-              <numPr>
-                <ilvl val="0"/>
-                <numId val="8"/>
-              </numPr>
-              <spacing after="120" line="480" lineRule="auto"/>
-              <ind left="346"/>
-              <rPr>
-                <rFonts ascii="Arial Nova" hAnsi="Arial Nova" cs="Times New Roman"/>
-                <bCs/>
-                <szCs val="22"/>
-              </rPr>
-            </pPr>
-            <r rsidRPr="00BC37A7">
-              <rPr>
-                <rFonts ascii="Arial Nova" hAnsi="Arial Nova" cs="Times New Roman"/>
-                <bCs/>
-                <szCs val="22"/>
-              </rPr>
-              <t xml:space="preserve">Vocabulaire nordique dépouillé : aucun ornement, la forme fait tout le travail</t>
-            </r>
-          </p>
-        </tc>
-      </tr>
-      <tr rsidR="00650BB3" rsidRPr="00B5571C" ns2:paraId="2511BBF5" ns2:textId="77777777" rsidTr="0024126A">
-        <tc>
-          <tcPr>
-            <tcW w="8647" type="dxa"/>
-            <gridSpan val="2"/>
-            <tcBorders>
-              <bottom val="dotted" sz="4" space="0" color="auto"/>
-            </tcBorders>
-          </tcPr>
-          <p ns2:paraId="2F8BE660" ns2:textId="3E6273D7" rsidR="00650BB3" rsidRPr="00B5571C" rsidRDefault="00650BB3" rsidP="00D922A2">
-            <pPr>
-              <spacing after="120"/>
-              <rPr>
-                <rFonts ascii="Arial Nova" hAnsi="Arial Nova" cs="Times New Roman"/>
-                <bCs/>
-                <sz val="20"/>
-              </rPr>
-            </pPr>
-            <r rsidRPr="00B5571C">
-              <rPr>
-                <rFonts ascii="Arial Nova" hAnsi="Arial Nova" cs="Times New Roman"/>
-                <bCs/>
-                <sz val="20"/>
-              </rPr>
-              <t xml:space="preserve">Source : www.archdaily.com/993112/farouche-tremblant-atelier-labri</t>
-            </r>
-          </p>
-        </tc>
-      </tr>
-      <tr rsidR="0024126A" rsidRPr="00B5571C" ns2:paraId="0B518030" ns2:textId="77777777" rsidTr="0024126A">
-        <tc>
-          <tcPr>
-            <tcW w="8647" type="dxa"/>
-            <gridSpan val="2"/>
-            <tcBorders>
-              <top val="dotted" sz="4" space="0" color="auto"/>
-            </tcBorders>
-          </tcPr>
-          <p ns2:paraId="1C3729F6" ns2:textId="77777777" rsidR="0024126A" rsidRPr="00B5571C" rsidRDefault="0024126A" rsidP="0024126A">
-            <pPr>
-              <spacing after="120" line="240" lineRule="auto"/>
-              <rPr>
-                <rFonts ascii="Arial Nova" hAnsi="Arial Nova" cs="Times New Roman"/>
-                <bCs/>
-                <sz val="20"/>
-              </rPr>
-            </pPr>
-          </p>
-        </tc>
-      </tr>
-      <tr rsidR="00650BB3" rsidRPr="00B5571C" ns2:paraId="1500713B" ns2:textId="77777777" rsidTr="00477DCD">
-        <tc>
-          <tcPr>
-            <tcW w="4081" type="dxa"/>
-          </tcPr>
-          <p ns2:paraId="346459A1" ns2:textId="0E54E82D" rsidR="00650BB3" rsidRPr="00B5571C" rsidRDefault="00650BB3" rsidP="00AD2F9E">
-            <pPr>
-              <spacing after="120" line="276" lineRule="auto"/>
-              <rPr>
-                <rFonts ascii="Arial Nova" hAnsi="Arial Nova" cs="Times New Roman"/>
-                <bCs/>
-                <sz val="24"/>
-                <szCs val="24"/>
-              </rPr>
-            </pPr>
-            <r rsidRPr="00B5571C">
-              <rPr>
-                <rFonts ascii="Arial Nova" hAnsi="Arial Nova" cs="Times New Roman"/>
-                <bCs/>
-                <i/>
-                <iCs/>
-                <color val="A6A6A6" themeColor="background1" themeShade="A6"/>
-                <sz val="24"/>
-                <szCs val="24"/>
-              </rPr>
-              <t>Placer votre image #</t>
-            </r>
-            <r rsidR="00A52381" rsidRPr="00B5571C">
-              <rPr>
-                <rFonts ascii="Arial Nova" hAnsi="Arial Nova" cs="Times New Roman"/>
-                <bCs/>
-                <i/>
-                <iCs/>
-                <color val="A6A6A6" themeColor="background1" themeShade="A6"/>
-                <sz val="24"/>
-                <szCs val="24"/>
-              </rPr>
-              <t>4</t>
-            </r>
-            <r rsidRPr="00B5571C">
-              <rPr>
-                <rFonts ascii="Arial Nova" hAnsi="Arial Nova" cs="Times New Roman"/>
-                <bCs/>
-                <i/>
-                <iCs/>
-                <color val="A6A6A6" themeColor="background1" themeShade="A6"/>
-                <sz val="24"/>
-                <szCs val="24"/>
-              </rPr>
-              <t xml:space="preserve"> ici</t>
-            </r>
-          </p>
-        </tc>
-        <tc>
-          <tcPr>
-            <tcW w="4566" type="dxa"/>
-            <vAlign val="center"/>
-          </tcPr>
-          <p ns2:paraId="29ACE81F" ns2:textId="77777777" rsidR="00D922A2" rsidRPr="00BC37A7" rsidRDefault="00D922A2" rsidP="00D922A2">
-            <pPr>
-              <pStyle val="Paragraphedeliste"/>
-              <numPr>
-                <ilvl val="0"/>
-                <numId val="8"/>
-              </numPr>
-              <spacing after="120" line="480" lineRule="auto"/>
-              <ind left="346"/>
-              <rPr>
-                <rFonts ascii="Arial Nova" hAnsi="Arial Nova" cs="Times New Roman"/>
-                <bCs/>
-                <szCs val="22"/>
-                <highlight val="yellow"/>
-              </rPr>
-            </pPr>
-            <r rsidRPr="00BC37A7">
-              <rPr>
-                <rFonts ascii="Arial Nova" hAnsi="Arial Nova" cs="Times New Roman"/>
-                <bCs/>
-                <szCs val="22"/>
-              </rPr>
-              <t xml:space="preserve">Mobilier intégré : banquette, rangements bas, tablettes en continu</t>
-            </r>
-          </p>
-          <p ns2:paraId="6951BD5C" ns2:textId="77777777" rsidR="00D922A2" rsidRPr="00BC37A7" rsidRDefault="00D922A2" rsidP="00D922A2">
-            <pPr>
-              <pStyle val="Paragraphedeliste"/>
-              <numPr>
-                <ilvl val="0"/>
-                <numId val="8"/>
-              </numPr>
-              <spacing after="120" line="480" lineRule="auto"/>
-              <ind left="346"/>
-              <rPr>
-                <rFonts ascii="Arial Nova" hAnsi="Arial Nova" cs="Times New Roman"/>
-                <bCs/>
-                <szCs val="22"/>
-              </rPr>
-            </pPr>
-            <r rsidRPr="00BC37A7">
-              <rPr>
-                <rFonts ascii="Arial Nova" hAnsi="Arial Nova" cs="Times New Roman"/>
-                <bCs/>
-                <szCs val="22"/>
-              </rPr>
-              <t xml:space="preserve">Terrasse couverte sous le débord de toit : pièce extérieure utilisable par mauvais temps</t>
-            </r>
-          </p>
-          <p ns2:paraId="6951BD5C" ns2:textId="77777777" rsidR="00D922A2" rsidRPr="00BC37A7" rsidRDefault="00D922A2" rsidP="00D922A2">
-            <pPr>
-              <pStyle val="Paragraphedeliste"/>
-              <numPr>
-                <ilvl val="0"/>
-                <numId val="8"/>
-              </numPr>
-              <spacing after="120" line="480" lineRule="auto"/>
-              <ind left="346"/>
-              <rPr>
-                <rFonts ascii="Arial Nova" hAnsi="Arial Nova" cs="Times New Roman"/>
-                <bCs/>
-                <szCs val="22"/>
-              </rPr>
-            </pPr>
-            <r rsidRPr="00BC37A7">
-              <rPr>
-                <rFonts ascii="Arial Nova" hAnsi="Arial Nova" cs="Times New Roman"/>
-                <bCs/>
-                <szCs val="22"/>
-              </rPr>
-              <t xml:space="preserve">Toiture monopente : volume simple, écoulement d’un seul côté</t>
-            </r>
-          </p>
-          <p ns2:paraId="6951BD5C" ns2:textId="77777777" rsidR="00D922A2" rsidRPr="00BC37A7" rsidRDefault="00D922A2" rsidP="00D922A2">
-            <pPr>
-              <pStyle val="Paragraphedeliste"/>
-              <numPr>
-                <ilvl val="0"/>
-                <numId val="8"/>
-              </numPr>
-              <spacing after="120" line="480" lineRule="auto"/>
-              <ind left="346"/>
-              <rPr>
-                <rFonts ascii="Arial Nova" hAnsi="Arial Nova" cs="Times New Roman"/>
-                <bCs/>
-                <szCs val="22"/>
-              </rPr>
-            </pPr>
-            <r rsidRPr="00BC37A7">
-              <rPr>
-                <rFonts ascii="Arial Nova" hAnsi="Arial Nova" cs="Times New Roman"/>
-                <bCs/>
-                <szCs val="22"/>
-              </rPr>
-              <t xml:space="preserve">Revêtement métallique clair, sans entretien</t>
-            </r>
-          </p>
-          <p ns2:paraId="6951BD5C" ns2:textId="77777777" rsidR="00D922A2" rsidRPr="00BC37A7" rsidRDefault="00D922A2" rsidP="00D922A2">
-            <pPr>
-              <pStyle val="Paragraphedeliste"/>
-              <numPr>
-                <ilvl val="0"/>
-                <numId val="8"/>
-              </numPr>
-              <spacing after="120" line="480" lineRule="auto"/>
-              <ind left="346"/>
-              <rPr>
-                <rFonts ascii="Arial Nova" hAnsi="Arial Nova" cs="Times New Roman"/>
-                <bCs/>
-                <szCs val="22"/>
-              </rPr>
-            </pPr>
-            <r rsidRPr="00BC37A7">
-              <rPr>
-                <rFonts ascii="Arial Nova" hAnsi="Arial Nova" cs="Times New Roman"/>
-                <bCs/>
-                <szCs val="22"/>
-              </rPr>
-              <t xml:space="preserve">Fenêtres qui cadrent des vues précises plutôt que d’ouvrir tout le mur</t>
-            </r>
-          </p>
-        </tc>
-      </tr>
-      <tr rsidR="00650BB3" rsidRPr="00B5571C" ns2:paraId="2D5FA5B1" ns2:textId="77777777" rsidTr="00477DCD">
-        <tc>
-          <tcPr>
-            <tcW w="8647" type="dxa"/>
-            <gridSpan val="2"/>
-          </tcPr>
-          <p ns2:paraId="486387DB" ns2:textId="66F984C9" rsidR="00650BB3" rsidRPr="00B5571C" rsidRDefault="00650BB3" rsidP="0024126A">
-            <pPr>
-              <spacing after="120"/>
-              <rPr>
-                <rFonts ascii="Arial Nova" hAnsi="Arial Nova" cs="Times New Roman"/>
-                <bCs/>
-                <sz val="20"/>
-              </rPr>
-            </pPr>
-            <r rsidRPr="00B5571C">
-              <rPr>
-                <rFonts ascii="Arial Nova" hAnsi="Arial Nova" cs="Times New Roman"/>
-                <bCs/>
-                <sz val="20"/>
-              </rPr>
-              <t xml:space="preserve">Source : www.archdaily.com/1012890/kanata-cabin-atelier-labri</t>
-            </r>
-          </p>
-          <p ns2:paraId="486387DB" ns2:textId="66F984C9" rsidR="00650BB3" rsidRPr="00B5571C" rsidRDefault="00650BB3" rsidP="0024126A">
-            <pPr>
-              <spacing after="120"/>
-              <rPr>
-                <rFonts ascii="Arial Nova" hAnsi="Arial Nova" cs="Times New Roman"/>
-                <bCs/>
-                <sz val="20"/>
-              </rPr>
-            </pPr>
-            <r rsidRPr="00B5571C">
-              <rPr>
-                <rFonts ascii="Arial Nova" hAnsi="Arial Nova" cs="Times New Roman"/>
-                <bCs/>
-                <sz val="20"/>
-              </rPr>
-              <t xml:space="preserve">Nombre de mots : 220</t>
-            </r>
-          </p>
-        </tc>
-      </tr>
-    </tbl>
-    <p ns2:paraId="54D36589" ns2:textId="6963497D" rsidR="00D2330F" rsidRPr="00B5571C" rsidRDefault="00D2330F" rsidP="006F7C07">
-      <pPr>
-        <jc val="both"/>
-        <rPr>
-          <rFonts ascii="Arial Nova" hAnsi="Arial Nova" cs="Times New Roman"/>
-          <bCs/>
-          <sz val="28"/>
-          <szCs val="28"/>
-        </rPr>
-      </pPr>
-    </p>
-    <p ns2:paraId="165E3057" ns2:textId="4631D5E4" rsidR="00BC37A7" rsidRDefault="00BC37A7">
-      <pPr>
-        <spacing after="160" line="259" lineRule="auto"/>
-        <rPr>
-          <rFonts ascii="Times New Roman" hAnsi="Times New Roman" cs="Times New Roman"/>
-          <bCs/>
-          <i/>
-          <iCs/>
-          <color val="A6A6A6" themeColor="background1" themeShade="A6"/>
-          <sz val="32"/>
-          <szCs val="32"/>
-          <u val="single"/>
-        </rPr>
-      </pPr>
-    </p>
-    <p ns2:paraId="493F76C4" ns2:textId="77777777" rsidR="003F3581" rsidRDefault="003F3581">
-      <pPr>
-        <spacing after="160" line="259" lineRule="auto"/>
-        <rPr>
-          <rFonts ascii="Times New Roman" hAnsi="Times New Roman" cs="Times New Roman"/>
-          <bCs/>
-          <i/>
-          <iCs/>
-          <color val="A6A6A6" themeColor="background1" themeShade="A6"/>
-          <sz val="32"/>
-          <szCs val="32"/>
-          <u val="single"/>
-        </rPr>
-      </pPr>
-    </p>
-    <p ns2:paraId="24C9FE43" ns2:textId="77777777" rsidR="003F3581" rsidRDefault="003F3581">
-      <pPr>
-        <spacing after="160" line="259" lineRule="auto"/>
-        <rPr>
-          <rFonts ascii="Times New Roman" hAnsi="Times New Roman" cs="Times New Roman"/>
-          <bCs/>
-          <i/>
-          <iCs/>
-          <color val="A6A6A6" themeColor="background1" themeShade="A6"/>
-          <sz val="32"/>
-          <szCs val="32"/>
-          <u val="single"/>
-        </rPr>
-      </pPr>
-      <r>
-        <rPr>
-          <rFonts ascii="Times New Roman" hAnsi="Times New Roman" cs="Times New Roman"/>
-          <bCs/>
-          <i/>
-          <iCs/>
-          <color val="A6A6A6" themeColor="background1" themeShade="A6"/>
-          <sz val="32"/>
-          <szCs val="32"/>
-          <u val="single"/>
-        </rPr>
-        <br type="page"/>
-      </r>
-    </p>
-    <p ns2:paraId="01BA0C2C" ns2:textId="22BC16F8" rsidR="00366F6C" rsidRPr="00037DD9" rsidRDefault="005D62D2" rsidP="006F7C07">
-      <pPr>
-        <jc val="both"/>
-        <rPr>
-          <rFonts ascii="Times New Roman" hAnsi="Times New Roman" cs="Times New Roman"/>
-          <bCs/>
-          <i/>
-          <iCs/>
-          <color val="A6A6A6" themeColor="background1" themeShade="A6"/>
-          <sz val="32"/>
-          <szCs val="32"/>
-        </rPr>
-      </pPr>
-      <r rsidRPr="00037DD9">
-        <rPr>
-          <rFonts ascii="Times New Roman" hAnsi="Times New Roman" cs="Times New Roman"/>
-          <bCs/>
-          <i/>
-          <iCs/>
-          <color val="A6A6A6" themeColor="background1" themeShade="A6"/>
-          <sz val="32"/>
-          <szCs val="32"/>
-          <u val="single"/>
-        </rPr>
-        <lastRenderedPageBreak/>
-        <t>Instructions</t>
-      </r>
-      <r rsidRPr="00037DD9">
-        <rPr>
-          <rFonts ascii="Times New Roman" hAnsi="Times New Roman" cs="Times New Roman"/>
-          <bCs/>
-          <i/>
-          <iCs/>
-          <color val="A6A6A6" themeColor="background1" themeShade="A6"/>
-          <sz val="32"/>
-          <szCs val="32"/>
-        </rPr>
-        <t xml:space="preserve"> : </t>
-      </r>
-    </p>
-    <p ns2:paraId="52C86B57" ns2:textId="77777777" rsidR="001A60B4" rsidRDefault="001A60B4" rsidP="001A60B4">
-      <pPr>
-        <pStyle val="Paragraphedeliste"/>
-        <numPr>
-          <ilvl val="0"/>
-          <numId val="7"/>
-        </numPr>
-        <jc val="both"/>
-        <rPr>
-          <rFonts ascii="Times New Roman" hAnsi="Times New Roman" cs="Times New Roman"/>
-          <bCs/>
-          <i/>
-          <iCs/>
-          <color val="A6A6A6" themeColor="background1" themeShade="A6"/>
-          <sz val="32"/>
-          <szCs val="32"/>
-        </rPr>
-      </pPr>
-      <r rsidRPr="00037DD9">
-        <rPr>
-          <rFonts ascii="Times New Roman" hAnsi="Times New Roman" cs="Times New Roman"/>
-          <bCs/>
-          <i/>
-          <iCs/>
-          <color val="A6A6A6" themeColor="background1" themeShade="A6"/>
-          <sz val="32"/>
-          <szCs val="32"/>
-        </rPr>
-        <t>Vous pouvez personnaliser le gabarit si vous le souhaitez (</t>
-      </r>
-      <r>
-        <rPr>
-          <rFonts ascii="Times New Roman" hAnsi="Times New Roman" cs="Times New Roman"/>
-          <bCs/>
-          <i/>
-          <iCs/>
-          <color val="A6A6A6" themeColor="background1" themeShade="A6"/>
-          <sz val="32"/>
-          <szCs val="32"/>
-        </rPr>
-        <t xml:space="preserve">la </t>
-      </r>
-      <r rsidRPr="00037DD9">
-        <rPr>
-          <rFonts ascii="Times New Roman" hAnsi="Times New Roman" cs="Times New Roman"/>
-          <bCs/>
-          <i/>
-          <iCs/>
-          <color val="A6A6A6" themeColor="background1" themeShade="A6"/>
-          <sz val="32"/>
-          <szCs val="32"/>
-        </rPr>
-        <t>police de text</t>
-      </r>
-      <r>
-        <rPr>
-          <rFonts ascii="Times New Roman" hAnsi="Times New Roman" cs="Times New Roman"/>
-          <bCs/>
-          <i/>
-          <iCs/>
-          <color val="A6A6A6" themeColor="background1" themeShade="A6"/>
-          <sz val="32"/>
-          <szCs val="32"/>
-        </rPr>
-        <t>e, par exemple</t>
-      </r>
-      <r rsidRPr="00037DD9">
-        <rPr>
-          <rFonts ascii="Times New Roman" hAnsi="Times New Roman" cs="Times New Roman"/>
-          <bCs/>
-          <i/>
-          <iCs/>
-          <color val="A6A6A6" themeColor="background1" themeShade="A6"/>
-          <sz val="32"/>
-          <szCs val="32"/>
-        </rPr>
-        <t>)</t>
-      </r>
-      <r>
-        <rPr>
-          <rFonts ascii="Times New Roman" hAnsi="Times New Roman" cs="Times New Roman"/>
-          <bCs/>
-          <i/>
-          <iCs/>
-          <color val="A6A6A6" themeColor="background1" themeShade="A6"/>
-          <sz val="32"/>
-          <szCs val="32"/>
-        </rPr>
-        <t>.</t>
-      </r>
-    </p>
-    <p ns2:paraId="32289230" ns2:textId="215DA0A4" rsidR="001A60B4" rsidRDefault="001A60B4" rsidP="001A60B4">
-      <pPr>
-        <pStyle val="Paragraphedeliste"/>
-        <numPr>
-          <ilvl val="0"/>
-          <numId val="7"/>
-        </numPr>
-        <jc val="both"/>
-        <rPr>
-          <rFonts ascii="Times New Roman" hAnsi="Times New Roman" cs="Times New Roman"/>
-          <bCs/>
-          <i/>
-          <iCs/>
-          <color val="A6A6A6" themeColor="background1" themeShade="A6"/>
-          <sz val="32"/>
-          <szCs val="32"/>
-        </rPr>
-      </pPr>
-      <r>
-        <rPr>
-          <rFonts ascii="Times New Roman" hAnsi="Times New Roman" cs="Times New Roman"/>
-          <bCs/>
-          <i/>
-          <iCs/>
-          <color val="A6A6A6" themeColor="background1" themeShade="A6"/>
-          <sz val="32"/>
-          <szCs val="32"/>
-        </rPr>
-        <t xml:space="preserve">Soignez la présentation : </t>
-      </r>
-      <r rsidR="004C48F0">
-        <rPr>
-          <rFonts ascii="Times New Roman" hAnsi="Times New Roman" cs="Times New Roman"/>
-          <bCs/>
-          <i/>
-          <iCs/>
-          <color val="A6A6A6" themeColor="background1" themeShade="A6"/>
-          <sz val="32"/>
-          <szCs val="32"/>
-        </rPr>
-        <t>les images doivent être de taille similaire, alignées, pas trop petites ni trop grosses</t>
-      </r>
-      <r rsidR="007B3F99">
-        <rPr>
-          <rFonts ascii="Times New Roman" hAnsi="Times New Roman" cs="Times New Roman"/>
-          <bCs/>
-          <i/>
-          <iCs/>
-          <color val="A6A6A6" themeColor="background1" themeShade="A6"/>
-          <sz val="32"/>
-          <szCs val="32"/>
-        </rPr>
-        <t xml:space="preserve"> (2 ou 3 par page)</t>
-      </r>
-      <r rsidR="004C48F0">
-        <rPr>
-          <rFonts ascii="Times New Roman" hAnsi="Times New Roman" cs="Times New Roman"/>
-          <bCs/>
-          <i/>
-          <iCs/>
-          <color val="A6A6A6" themeColor="background1" themeShade="A6"/>
-          <sz val="32"/>
-          <szCs val="32"/>
-        </rPr>
-        <t>.</t>
-      </r>
-    </p>
-    <p ns2:paraId="17AD1ED3" ns2:textId="57BD4C66" rsidR="00366F6C" rsidRPr="00037DD9" rsidRDefault="00366F6C" rsidP="00366F6C">
-      <pPr>
-        <pStyle val="Paragraphedeliste"/>
-        <numPr>
-          <ilvl val="0"/>
-          <numId val="7"/>
-        </numPr>
-        <jc val="both"/>
-        <rPr>
-          <rFonts ascii="Times New Roman" hAnsi="Times New Roman" cs="Times New Roman"/>
-          <bCs/>
-          <i/>
-          <iCs/>
-          <color val="A6A6A6" themeColor="background1" themeShade="A6"/>
-          <sz val="32"/>
-          <szCs val="32"/>
-        </rPr>
-      </pPr>
-      <r rsidRPr="00037DD9">
-        <rPr>
-          <rFonts ascii="Times New Roman" hAnsi="Times New Roman" cs="Times New Roman"/>
-          <bCs/>
-          <i/>
-          <iCs/>
-          <color val="A6A6A6" themeColor="background1" themeShade="A6"/>
-          <sz val="32"/>
-          <szCs val="32"/>
-        </rPr>
-        <t>N</t>
-      </r>
-      <r rsidR="005D62D2" rsidRPr="00037DD9">
-        <rPr>
-          <rFonts ascii="Times New Roman" hAnsi="Times New Roman" cs="Times New Roman"/>
-          <bCs/>
-          <i/>
-          <iCs/>
-          <color val="A6A6A6" themeColor="background1" themeShade="A6"/>
-          <sz val="32"/>
-          <szCs val="32"/>
-        </rPr>
-        <t xml:space="preserve">’oubliez pas d’effacer tout le texte en gris </t>
-      </r>
-      <r rsidR="005A4450" rsidRPr="00037DD9">
-        <rPr>
-          <rFonts ascii="Times New Roman" hAnsi="Times New Roman" cs="Times New Roman"/>
-          <bCs/>
-          <i/>
-          <iCs/>
-          <color val="A6A6A6" themeColor="background1" themeShade="A6"/>
-          <sz val="32"/>
-          <szCs val="32"/>
-        </rPr>
-        <t xml:space="preserve">et d’enlever le surlignage jaune </t>
-      </r>
-      <r rsidR="005D62D2" rsidRPr="00037DD9">
-        <rPr>
-          <rFonts ascii="Times New Roman" hAnsi="Times New Roman" cs="Times New Roman"/>
-          <bCs/>
-          <i/>
-          <iCs/>
-          <color val="A6A6A6" themeColor="background1" themeShade="A6"/>
-          <sz val="32"/>
-          <szCs val="32"/>
-        </rPr>
-        <t>avant d’imprimer!!!</t>
-      </r>
-      <r rsidRPr="00037DD9">
-        <rPr>
-          <rFonts ascii="Times New Roman" hAnsi="Times New Roman" cs="Times New Roman"/>
-          <bCs/>
-          <i/>
-          <iCs/>
-          <color val="A6A6A6" themeColor="background1" themeShade="A6"/>
-          <sz val="32"/>
-          <szCs val="32"/>
-        </rPr>
-        <t xml:space="preserve"> </t>
-      </r>
-    </p>
-    <p ns2:paraId="5222EB5E" ns2:textId="1D2E9D57" rsidR="00477DCD" rsidRPr="00037DD9" rsidRDefault="00477DCD" rsidP="00366F6C">
-      <pPr>
-        <pStyle val="Paragraphedeliste"/>
-        <numPr>
-          <ilvl val="0"/>
-          <numId val="7"/>
-        </numPr>
-        <jc val="both"/>
-        <rPr>
-          <rFonts ascii="Times New Roman" hAnsi="Times New Roman" cs="Times New Roman"/>
-          <bCs/>
-          <i/>
-          <iCs/>
-          <color val="A6A6A6" themeColor="background1" themeShade="A6"/>
-          <sz val="32"/>
-          <szCs val="32"/>
-        </rPr>
-      </pPr>
-      <r>
-        <rPr>
-          <rFonts ascii="Times New Roman" hAnsi="Times New Roman" cs="Times New Roman"/>
-          <bCs/>
-          <i/>
-          <iCs/>
-          <color val="A6A6A6" themeColor="background1" themeShade="A6"/>
-          <sz val="32"/>
-          <szCs val="32"/>
-        </rPr>
-        <t>Rappel : imprimer en recto seulement (insérer des pages blanches</t>
-      </r>
-      <r rsidR="001B1370">
-        <rPr>
-          <rFonts ascii="Times New Roman" hAnsi="Times New Roman" cs="Times New Roman"/>
-          <bCs/>
-          <i/>
-          <iCs/>
-          <color val="A6A6A6" themeColor="background1" themeShade="A6"/>
-          <sz val="32"/>
-          <szCs val="32"/>
-        </rPr>
-        <t xml:space="preserve"> au besoin).</t>
-      </r>
-    </p>
-    <p ns2:paraId="0464EB18" ns2:textId="77777777" rsidR="00375D31" rsidRPr="00037DD9" rsidRDefault="00375D31" rsidP="00350A1F">
-      <pPr>
-        <spacing after="180" line="276" lineRule="auto"/>
-        <rPr>
-          <rFonts ascii="Times New Roman" hAnsi="Times New Roman" cs="Times New Roman"/>
-          <b/>
-          <sz val="28"/>
-          <szCs val="28"/>
-        </rPr>
-      </pPr>
-    </p>
-    <p ns2:paraId="426F0426" ns2:textId="0512CC70" rsidR="00EF1D7E" rsidRPr="00037DD9" rsidRDefault="00EF1D7E" rsidP="007F4398">
-      <pPr>
-        <spacing after="160" line="259" lineRule="auto"/>
-        <rPr>
-          <rFonts ascii="Times New Roman" hAnsi="Times New Roman" cs="Times New Roman"/>
-          <b/>
-          <sz val="28"/>
-          <szCs val="28"/>
-        </rPr>
-      </pPr>
-    </p>
-    <sectPr rsidR="00EF1D7E" rsidRPr="00037DD9" rsidSect="00292BA3">
-      <pgSz w="12240" h="15840"/>
-      <pgMar top="1440" right="1800" bottom="1440" left="1800" header="709" footer="130" gutter="0"/>
-      <cols space="708"/>
-      <docGrid linePitch="360"/>
-    </sectPr>
-  </body>
-</document>
+<w:document xmlns:wpc="http://schemas.microsoft.com/office/word/2010/wordprocessingCanvas" xmlns:cx="http://schemas.microsoft.com/office/drawing/2014/chartex" xmlns:cx1="http://schemas.microsoft.com/office/drawing/2015/9/8/chartex" xmlns:cx2="http://schemas.microsoft.com/office/drawing/2015/10/21/chartex" xmlns:cx3="http://schemas.microsoft.com/office/drawing/2016/5/9/chartex" xmlns:cx4="http://schemas.microsoft.com/office/drawing/2016/5/10/chartex" xmlns:cx5="http://schemas.microsoft.com/office/drawing/2016/5/11/chartex" xmlns:cx6="http://schemas.microsoft.com/office/drawing/2016/5/12/chartex" xmlns:cx7="http://schemas.microsoft.com/office/drawing/2016/5/13/chartex" xmlns:cx8="http://schemas.microsoft.com/office/drawing/2016/5/14/chartex" xmlns:mc="http://schemas.openxmlformats.org/markup-compatibility/2006" xmlns:aink="http://schemas.microsoft.com/office/drawing/2016/ink" xmlns:am3d="http://schemas.microsoft.com/office/drawing/2017/model3d" xmlns:o="urn:schemas-microsoft-com:office:office" xmlns:oel="http://schemas.microsoft.com/office/2019/extlst" xmlns:r="http://schemas.openxmlformats.org/officeDocument/2006/relationships" xmlns:m="http://schemas.openxmlformats.org/officeDocument/2006/math" xmlns:v="urn:schemas-microsoft-com:vml" xmlns:wp14="http://schemas.microsoft.com/office/word/2010/wordprocessingDrawing" xmlns:wp="http://schemas.openxmlformats.org/drawingml/2006/wordprocessingDrawing" xmlns:w10="urn:schemas-microsoft-com:office:word" xmlns:w="http://schemas.openxmlformats.org/wordprocessingml/2006/main" xmlns:w14="http://schemas.microsoft.com/office/word/2010/wordml" xmlns:w15="http://schemas.microsoft.com/office/word/2012/wordml" xmlns:w16cex="http://schemas.microsoft.com/office/word/2018/wordml/cex" xmlns:w16cid="http://schemas.microsoft.com/office/word/2016/wordml/cid" xmlns:w16="http://schemas.microsoft.com/office/word/2018/wordml" xmlns:w16du="http://schemas.microsoft.com/office/word/2023/wordml/word16du" xmlns:w16sdtdh="http://schemas.microsoft.com/office/word/2020/wordml/sdtdatahash" xmlns:w16sdtfl="http://schemas.microsoft.com/office/word/2024/wordml/sdtformatlock" xmlns:w16se="http://schemas.microsoft.com/office/word/2015/wordml/symex" xmlns:wpg="http://schemas.microsoft.com/office/word/2010/wordprocessingGroup" xmlns:wpi="http://schemas.microsoft.com/office/word/2010/wordprocessingInk" xmlns:wne="http://schemas.microsoft.com/office/word/2006/wordml" xmlns:wps="http://schemas.microsoft.com/office/word/2010/wordprocessingShape" mc:Ignorable="w14 w15 w16se w16cid w16 w16cex w16sdtdh w16sdtfl w16du wp14">
+  <w:body>
+    <w:p>
+      <w:pPr>
+        <w:jc w:val="center"/>
+        <w:rPr>
+          <w:rFonts w:ascii="Arial Nova" w:hAnsi="Arial Nova" w:cs="Times New Roman"/>
+          <w:b/>
+          <w:sz w:val="24"/>
+          <w:szCs w:val="24"/>
+        </w:rPr>
+      </w:pPr>
+      <w:r>
+        <w:rPr>
+          <w:rFonts w:ascii="Arial Nova" w:hAnsi="Arial Nova" w:cs="Times New Roman"/>
+          <w:b/>
+          <w:sz w:val="24"/>
+          <w:szCs w:val="24"/>
+        </w:rPr>
+        <w:t>ÉTUDE DE PRÉCÉDENTS</w:t>
+      </w:r>
+    </w:p>
+    <w:p>
+      <w:pPr>
+        <w:rPr>
+          <w:rFonts w:ascii="Arial Nova" w:hAnsi="Arial Nova" w:cs="Times New Roman"/>
+          <w:bCs/>
+          <w:sz w:val="28"/>
+          <w:szCs w:val="28"/>
+        </w:rPr>
+      </w:pPr>
+    </w:p>
+    <w:tbl>
+      <w:tblPr>
+        <w:tblStyle w:val="Grilledetableauclaire"/>
+        <w:tblW w:w="8647" w:type="dxa"/>
+        <w:tblBorders>
+          <w:top w:val="none" w:sz="0" w:space="0" w:color="auto"/>
+          <w:left w:val="none" w:sz="0" w:space="0" w:color="auto"/>
+          <w:bottom w:val="none" w:sz="0" w:space="0" w:color="auto"/>
+          <w:right w:val="none" w:sz="0" w:space="0" w:color="auto"/>
+          <w:insideH w:val="none" w:sz="0" w:space="0" w:color="auto"/>
+          <w:insideV w:val="none" w:sz="0" w:space="0" w:color="auto"/>
+        </w:tblBorders>
+        <w:tblLook w:val="04A0" w:firstRow="1" w:lastRow="0" w:firstColumn="1" w:lastColumn="0" w:noHBand="0" w:noVBand="1"/>
+      </w:tblPr>
+      <w:tblGrid>
+        <w:gridCol w:w="4081"/>
+        <w:gridCol w:w="4566"/>
+      </w:tblGrid>
+      <w:tr>
+        <w:tc>
+          <w:tcPr>
+            <w:tcW w:w="4081" w:type="dxa"/>
+          </w:tcPr>
+          <w:p>
+            <w:pPr>
+              <w:spacing w:after="120" w:line="276" w:lineRule="auto"/>
+              <w:rPr>
+                <w:rFonts w:ascii="Arial Nova" w:hAnsi="Arial Nova" w:cs="Times New Roman"/>
+                <w:bCs/>
+                <w:i/>
+                <w:iCs/>
+                <w:sz w:val="24"/>
+                <w:szCs w:val="24"/>
+              </w:rPr>
+            </w:pPr>
+            <w:r>
+              <w:rPr>
+                <w:rFonts w:ascii="Arial Nova" w:hAnsi="Arial Nova" w:cs="Times New Roman"/>
+                <w:bCs/>
+                <w:i/>
+                <w:iCs/>
+                <w:color w:val="A6A6A6" w:themeColor="background1" w:themeShade="A6"/>
+                <w:sz w:val="24"/>
+                <w:szCs w:val="24"/>
+              </w:rPr>
+              <w:t>Placer votre image #</w:t>
+            </w:r>
+            <w:r>
+              <w:rPr>
+                <w:rFonts w:ascii="Arial Nova" w:hAnsi="Arial Nova" w:cs="Times New Roman"/>
+                <w:bCs/>
+                <w:i/>
+                <w:iCs/>
+                <w:color w:val="A6A6A6" w:themeColor="background1" w:themeShade="A6"/>
+                <w:sz w:val="24"/>
+                <w:szCs w:val="24"/>
+              </w:rPr>
+              <w:t>1</w:t>
+            </w:r>
+            <w:r>
+              <w:rPr>
+                <w:rFonts w:ascii="Arial Nova" w:hAnsi="Arial Nova" w:cs="Times New Roman"/>
+                <w:bCs/>
+                <w:i/>
+                <w:iCs/>
+                <w:color w:val="A6A6A6" w:themeColor="background1" w:themeShade="A6"/>
+                <w:sz w:val="24"/>
+                <w:szCs w:val="24"/>
+              </w:rPr>
+              <w:t xml:space="preserve"> ici</w:t>
+            </w:r>
+          </w:p>
+        </w:tc>
+        <w:tc>
+          <w:tcPr>
+            <w:tcW w:w="4566" w:type="dxa"/>
+            <w:vAlign w:val="center"/>
+          </w:tcPr>
+          <w:p>
+            <w:pPr>
+              <w:pStyle w:val="Paragraphedeliste"/>
+              <w:numPr>
+                <w:ilvl w:val="0"/>
+                <w:numId w:val="8"/>
+              </w:numPr>
+              <w:spacing w:after="120" w:line="480" w:lineRule="auto"/>
+              <w:ind w:left="346"/>
+              <w:rPr>
+                <w:rFonts w:ascii="Arial Nova" w:hAnsi="Arial Nova" w:cs="Times New Roman"/>
+                <w:bCs/>
+                <w:szCs w:val="22"/>
+                <w:highlight w:val="yellow"/>
+              </w:rPr>
+            </w:pPr>
+            <w:r>
+              <w:rPr>
+                <w:rFonts w:ascii="Arial Nova" w:hAnsi="Arial Nova" w:cs="Times New Roman"/>
+                <w:bCs/>
+                <w:szCs w:val="22"/>
+              </w:rPr>
+              <w:t xml:space="preserve">Volume surélevé sur pilotis : empreinte au sol minimale, peu d’excavation</w:t>
+            </w:r>
+          </w:p>
+          <w:p>
+            <w:pPr>
+              <w:pStyle w:val="Paragraphedeliste"/>
+              <w:numPr>
+                <w:ilvl w:val="0"/>
+                <w:numId w:val="8"/>
+              </w:numPr>
+              <w:spacing w:after="120" w:line="480" w:lineRule="auto"/>
+              <w:ind w:left="346"/>
+              <w:rPr>
+                <w:rFonts w:ascii="Arial Nova" w:hAnsi="Arial Nova" w:cs="Times New Roman"/>
+                <w:bCs/>
+                <w:szCs w:val="22"/>
+              </w:rPr>
+            </w:pPr>
+            <w:r>
+              <w:rPr>
+                <w:rFonts w:ascii="Arial Nova" w:hAnsi="Arial Nova" w:cs="Times New Roman"/>
+                <w:bCs/>
+                <w:szCs w:val="22"/>
+              </w:rPr>
+              <w:t xml:space="preserve">Terrain boisé en pente conservé sous le bâtiment</w:t>
+            </w:r>
+          </w:p>
+          <w:p>
+            <w:pPr>
+              <w:pStyle w:val="Paragraphedeliste"/>
+              <w:numPr>
+                <w:ilvl w:val="0"/>
+                <w:numId w:val="8"/>
+              </w:numPr>
+              <w:spacing w:after="120" w:line="480" w:lineRule="auto"/>
+              <w:ind w:left="346"/>
+              <w:rPr>
+                <w:rFonts w:ascii="Arial Nova" w:hAnsi="Arial Nova" w:cs="Times New Roman"/>
+                <w:bCs/>
+                <w:szCs w:val="22"/>
+              </w:rPr>
+            </w:pPr>
+            <w:r>
+              <w:rPr>
+                <w:rFonts w:ascii="Arial Nova" w:hAnsi="Arial Nova" w:cs="Times New Roman"/>
+                <w:bCs/>
+                <w:szCs w:val="22"/>
+              </w:rPr>
+              <w:t xml:space="preserve">Espace couvert sous le plancher : abri et rangement extérieur</w:t>
+            </w:r>
+          </w:p>
+          <w:p>
+            <w:pPr>
+              <w:pStyle w:val="Paragraphedeliste"/>
+              <w:numPr>
+                <w:ilvl w:val="0"/>
+                <w:numId w:val="8"/>
+              </w:numPr>
+              <w:spacing w:after="120" w:line="480" w:lineRule="auto"/>
+              <w:ind w:left="346"/>
+              <w:rPr>
+                <w:rFonts w:ascii="Arial Nova" w:hAnsi="Arial Nova" w:cs="Times New Roman"/>
+                <w:bCs/>
+                <w:szCs w:val="22"/>
+              </w:rPr>
+            </w:pPr>
+            <w:r>
+              <w:rPr>
+                <w:rFonts w:ascii="Arial Nova" w:hAnsi="Arial Nova" w:cs="Times New Roman"/>
+                <w:bCs/>
+                <w:szCs w:val="22"/>
+              </w:rPr>
+              <w:t xml:space="preserve">Grande baie vitrée orientée au sud : gain solaire et cadrage du paysage</w:t>
+            </w:r>
+          </w:p>
+          <w:p>
+            <w:pPr>
+              <w:pStyle w:val="Paragraphedeliste"/>
+              <w:numPr>
+                <w:ilvl w:val="0"/>
+                <w:numId w:val="8"/>
+              </w:numPr>
+              <w:spacing w:after="120" w:line="480" w:lineRule="auto"/>
+              <w:ind w:left="346"/>
+              <w:rPr>
+                <w:rFonts w:ascii="Arial Nova" w:hAnsi="Arial Nova" w:cs="Times New Roman"/>
+                <w:bCs/>
+                <w:szCs w:val="22"/>
+              </w:rPr>
+            </w:pPr>
+            <w:r>
+              <w:rPr>
+                <w:rFonts w:ascii="Arial Nova" w:hAnsi="Arial Nova" w:cs="Times New Roman"/>
+                <w:bCs/>
+                <w:szCs w:val="22"/>
+              </w:rPr>
+              <w:t xml:space="preserve">Volumétrie épurée, sans décrochement inutile</w:t>
+            </w:r>
+          </w:p>
+        </w:tc>
+      </w:tr>
+      <w:tr>
+        <w:tc>
+          <w:tcPr>
+            <w:tcW w:w="8647" w:type="dxa"/>
+            <w:gridSpan w:val="2"/>
+            <w:tcBorders>
+              <w:bottom w:val="dotted" w:sz="4" w:space="0" w:color="auto"/>
+            </w:tcBorders>
+          </w:tcPr>
+          <w:p>
+            <w:pPr>
+              <w:spacing w:after="120"/>
+              <w:rPr>
+                <w:rFonts w:ascii="Arial Nova" w:hAnsi="Arial Nova" w:cs="Times New Roman"/>
+                <w:bCs/>
+                <w:sz w:val="20"/>
+              </w:rPr>
+            </w:pPr>
+            <w:r>
+              <w:rPr>
+                <w:rFonts w:ascii="Arial Nova" w:hAnsi="Arial Nova" w:cs="Times New Roman"/>
+                <w:bCs/>
+                <w:sz w:val="20"/>
+              </w:rPr>
+              <w:t xml:space="preserve">Source : www.archdaily.com/1014890/residence-chez-leon-quinzhee-architecture</w:t>
+            </w:r>
+          </w:p>
+        </w:tc>
+      </w:tr>
+      <w:tr>
+        <w:tc>
+          <w:tcPr>
+            <w:tcW w:w="8647" w:type="dxa"/>
+            <w:gridSpan w:val="2"/>
+            <w:tcBorders>
+              <w:top w:val="dotted" w:sz="4" w:space="0" w:color="auto"/>
+            </w:tcBorders>
+          </w:tcPr>
+          <w:p>
+            <w:pPr>
+              <w:spacing w:after="120" w:line="240" w:lineRule="auto"/>
+              <w:rPr>
+                <w:rFonts w:ascii="Arial Nova" w:hAnsi="Arial Nova" w:cs="Times New Roman"/>
+                <w:bCs/>
+                <w:sz w:val="20"/>
+              </w:rPr>
+            </w:pPr>
+          </w:p>
+        </w:tc>
+      </w:tr>
+      <w:tr>
+        <w:tc>
+          <w:tcPr>
+            <w:tcW w:w="4081" w:type="dxa"/>
+          </w:tcPr>
+          <w:p>
+            <w:pPr>
+              <w:spacing w:after="120" w:line="276" w:lineRule="auto"/>
+              <w:rPr>
+                <w:rFonts w:ascii="Arial Nova" w:hAnsi="Arial Nova" w:cs="Times New Roman"/>
+                <w:bCs/>
+                <w:sz w:val="24"/>
+                <w:szCs w:val="24"/>
+              </w:rPr>
+            </w:pPr>
+            <w:r>
+              <w:rPr>
+                <w:rFonts w:ascii="Arial Nova" w:hAnsi="Arial Nova" w:cs="Times New Roman"/>
+                <w:bCs/>
+                <w:i/>
+                <w:iCs/>
+                <w:color w:val="A6A6A6" w:themeColor="background1" w:themeShade="A6"/>
+                <w:sz w:val="24"/>
+                <w:szCs w:val="24"/>
+              </w:rPr>
+              <w:t>Placer votre image #</w:t>
+            </w:r>
+            <w:r>
+              <w:rPr>
+                <w:rFonts w:ascii="Arial Nova" w:hAnsi="Arial Nova" w:cs="Times New Roman"/>
+                <w:bCs/>
+                <w:i/>
+                <w:iCs/>
+                <w:color w:val="A6A6A6" w:themeColor="background1" w:themeShade="A6"/>
+                <w:sz w:val="24"/>
+                <w:szCs w:val="24"/>
+              </w:rPr>
+              <w:t>2</w:t>
+            </w:r>
+            <w:r>
+              <w:rPr>
+                <w:rFonts w:ascii="Arial Nova" w:hAnsi="Arial Nova" w:cs="Times New Roman"/>
+                <w:bCs/>
+                <w:i/>
+                <w:iCs/>
+                <w:color w:val="A6A6A6" w:themeColor="background1" w:themeShade="A6"/>
+                <w:sz w:val="24"/>
+                <w:szCs w:val="24"/>
+              </w:rPr>
+              <w:t xml:space="preserve"> ici</w:t>
+            </w:r>
+          </w:p>
+        </w:tc>
+        <w:tc>
+          <w:tcPr>
+            <w:tcW w:w="4566" w:type="dxa"/>
+            <w:vAlign w:val="center"/>
+          </w:tcPr>
+          <w:p>
+            <w:pPr>
+              <w:pStyle w:val="Paragraphedeliste"/>
+              <w:numPr>
+                <w:ilvl w:val="0"/>
+                <w:numId w:val="8"/>
+              </w:numPr>
+              <w:spacing w:after="120" w:line="480" w:lineRule="auto"/>
+              <w:ind w:left="346"/>
+              <w:rPr>
+                <w:rFonts w:ascii="Arial Nova" w:hAnsi="Arial Nova" w:cs="Times New Roman"/>
+                <w:bCs/>
+                <w:szCs w:val="22"/>
+                <w:highlight w:val="yellow"/>
+              </w:rPr>
+            </w:pPr>
+            <w:r>
+              <w:rPr>
+                <w:rFonts w:ascii="Arial Nova" w:hAnsi="Arial Nova" w:cs="Times New Roman"/>
+                <w:bCs/>
+                <w:szCs w:val="22"/>
+              </w:rPr>
+              <w:t xml:space="preserve">Toiture à deux versants : silhouette simple, la neige se dégage seule</w:t>
+            </w:r>
+          </w:p>
+          <w:p>
+            <w:pPr>
+              <w:pStyle w:val="Paragraphedeliste"/>
+              <w:numPr>
+                <w:ilvl w:val="0"/>
+                <w:numId w:val="8"/>
+              </w:numPr>
+              <w:spacing w:after="120" w:line="480" w:lineRule="auto"/>
+              <w:ind w:left="346"/>
+              <w:rPr>
+                <w:rFonts w:ascii="Arial Nova" w:hAnsi="Arial Nova" w:cs="Times New Roman"/>
+                <w:bCs/>
+                <w:szCs w:val="22"/>
+              </w:rPr>
+            </w:pPr>
+            <w:r>
+              <w:rPr>
+                <w:rFonts w:ascii="Arial Nova" w:hAnsi="Arial Nova" w:cs="Times New Roman"/>
+                <w:bCs/>
+                <w:szCs w:val="22"/>
+              </w:rPr>
+              <w:t xml:space="preserve">Revêtement d’acier profilé noir : entretien minimal, contraste avec le boisé</w:t>
+            </w:r>
+          </w:p>
+          <w:p>
+            <w:pPr>
+              <w:pStyle w:val="Paragraphedeliste"/>
+              <w:numPr>
+                <w:ilvl w:val="0"/>
+                <w:numId w:val="8"/>
+              </w:numPr>
+              <w:spacing w:after="120" w:line="480" w:lineRule="auto"/>
+              <w:ind w:left="346"/>
+              <w:rPr>
+                <w:rFonts w:ascii="Arial Nova" w:hAnsi="Arial Nova" w:cs="Times New Roman"/>
+                <w:bCs/>
+                <w:szCs w:val="22"/>
+              </w:rPr>
+            </w:pPr>
+            <w:r>
+              <w:rPr>
+                <w:rFonts w:ascii="Arial Nova" w:hAnsi="Arial Nova" w:cs="Times New Roman"/>
+                <w:bCs/>
+                <w:szCs w:val="22"/>
+              </w:rPr>
+              <w:t xml:space="preserve">Terrasse de cèdre qui relie les volumes et prolonge l’aire de vie</w:t>
+            </w:r>
+          </w:p>
+          <w:p>
+            <w:pPr>
+              <w:pStyle w:val="Paragraphedeliste"/>
+              <w:numPr>
+                <w:ilvl w:val="0"/>
+                <w:numId w:val="8"/>
+              </w:numPr>
+              <w:spacing w:after="120" w:line="480" w:lineRule="auto"/>
+              <w:ind w:left="346"/>
+              <w:rPr>
+                <w:rFonts w:ascii="Arial Nova" w:hAnsi="Arial Nova" w:cs="Times New Roman"/>
+                <w:bCs/>
+                <w:szCs w:val="22"/>
+              </w:rPr>
+            </w:pPr>
+            <w:r>
+              <w:rPr>
+                <w:rFonts w:ascii="Arial Nova" w:hAnsi="Arial Nova" w:cs="Times New Roman"/>
+                <w:bCs/>
+                <w:szCs w:val="22"/>
+              </w:rPr>
+              <w:t xml:space="preserve">Rapport plein/vide marqué : mur presque aveugle d’un côté, large ouverture de l’autre</w:t>
+            </w:r>
+          </w:p>
+          <w:p>
+            <w:pPr>
+              <w:pStyle w:val="Paragraphedeliste"/>
+              <w:numPr>
+                <w:ilvl w:val="0"/>
+                <w:numId w:val="8"/>
+              </w:numPr>
+              <w:spacing w:after="120" w:line="480" w:lineRule="auto"/>
+              <w:ind w:left="346"/>
+              <w:rPr>
+                <w:rFonts w:ascii="Arial Nova" w:hAnsi="Arial Nova" w:cs="Times New Roman"/>
+                <w:bCs/>
+                <w:szCs w:val="22"/>
+              </w:rPr>
+            </w:pPr>
+            <w:r>
+              <w:rPr>
+                <w:rFonts w:ascii="Arial Nova" w:hAnsi="Arial Nova" w:cs="Times New Roman"/>
+                <w:bCs/>
+                <w:szCs w:val="22"/>
+              </w:rPr>
+              <w:t xml:space="preserve">Palette réduite à deux matériaux : métal sombre et bois clair</w:t>
+            </w:r>
+          </w:p>
+        </w:tc>
+      </w:tr>
+      <w:tr>
+        <w:tc>
+          <w:tcPr>
+            <w:tcW w:w="8647" w:type="dxa"/>
+            <w:gridSpan w:val="2"/>
+            <w:tcBorders>
+              <w:bottom w:val="dotted" w:sz="4" w:space="0" w:color="auto"/>
+            </w:tcBorders>
+          </w:tcPr>
+          <w:p>
+            <w:pPr>
+              <w:spacing w:after="120"/>
+              <w:rPr>
+                <w:rFonts w:ascii="Arial Nova" w:hAnsi="Arial Nova" w:cs="Times New Roman"/>
+                <w:bCs/>
+                <w:sz w:val="20"/>
+              </w:rPr>
+            </w:pPr>
+            <w:r>
+              <w:rPr>
+                <w:rFonts w:ascii="Arial Nova" w:hAnsi="Arial Nova" w:cs="Times New Roman"/>
+                <w:bCs/>
+                <w:sz w:val="20"/>
+              </w:rPr>
+              <w:t xml:space="preserve">Source : www.archdaily.com/915980/grand-pic-chalet-appareil-architecture</w:t>
+            </w:r>
+          </w:p>
+        </w:tc>
+      </w:tr>
+      <w:tr>
+        <w:tc>
+          <w:tcPr>
+            <w:tcW w:w="8647" w:type="dxa"/>
+            <w:gridSpan w:val="2"/>
+            <w:tcBorders>
+              <w:top w:val="dotted" w:sz="4" w:space="0" w:color="auto"/>
+            </w:tcBorders>
+          </w:tcPr>
+          <w:p>
+            <w:pPr>
+              <w:spacing w:after="120" w:line="240" w:lineRule="auto"/>
+              <w:rPr>
+                <w:rFonts w:ascii="Arial Nova" w:hAnsi="Arial Nova" w:cs="Times New Roman"/>
+                <w:bCs/>
+                <w:sz w:val="20"/>
+              </w:rPr>
+            </w:pPr>
+          </w:p>
+        </w:tc>
+      </w:tr>
+      <w:tr>
+        <w:tc>
+          <w:tcPr>
+            <w:tcW w:w="4081" w:type="dxa"/>
+          </w:tcPr>
+          <w:p>
+            <w:pPr>
+              <w:spacing w:after="120" w:line="276" w:lineRule="auto"/>
+              <w:rPr>
+                <w:rFonts w:ascii="Arial Nova" w:hAnsi="Arial Nova" w:cs="Times New Roman"/>
+                <w:bCs/>
+                <w:sz w:val="24"/>
+                <w:szCs w:val="24"/>
+              </w:rPr>
+            </w:pPr>
+            <w:r>
+              <w:rPr>
+                <w:rFonts w:ascii="Arial Nova" w:hAnsi="Arial Nova" w:cs="Times New Roman"/>
+                <w:bCs/>
+                <w:i/>
+                <w:iCs/>
+                <w:color w:val="A6A6A6" w:themeColor="background1" w:themeShade="A6"/>
+                <w:sz w:val="24"/>
+                <w:szCs w:val="24"/>
+              </w:rPr>
+              <w:t>Placer votre image #</w:t>
+            </w:r>
+            <w:r>
+              <w:rPr>
+                <w:rFonts w:ascii="Arial Nova" w:hAnsi="Arial Nova" w:cs="Times New Roman"/>
+                <w:bCs/>
+                <w:i/>
+                <w:iCs/>
+                <w:color w:val="A6A6A6" w:themeColor="background1" w:themeShade="A6"/>
+                <w:sz w:val="24"/>
+                <w:szCs w:val="24"/>
+              </w:rPr>
+              <w:t>3</w:t>
+            </w:r>
+            <w:r>
+              <w:rPr>
+                <w:rFonts w:ascii="Arial Nova" w:hAnsi="Arial Nova" w:cs="Times New Roman"/>
+                <w:bCs/>
+                <w:i/>
+                <w:iCs/>
+                <w:color w:val="A6A6A6" w:themeColor="background1" w:themeShade="A6"/>
+                <w:sz w:val="24"/>
+                <w:szCs w:val="24"/>
+              </w:rPr>
+              <w:t xml:space="preserve"> ici</w:t>
+            </w:r>
+          </w:p>
+        </w:tc>
+        <w:tc>
+          <w:tcPr>
+            <w:tcW w:w="4566" w:type="dxa"/>
+            <w:vAlign w:val="center"/>
+          </w:tcPr>
+          <w:p>
+            <w:pPr>
+              <w:pStyle w:val="Paragraphedeliste"/>
+              <w:numPr>
+                <w:ilvl w:val="0"/>
+                <w:numId w:val="8"/>
+              </w:numPr>
+              <w:spacing w:after="120" w:line="480" w:lineRule="auto"/>
+              <w:ind w:left="346"/>
+              <w:rPr>
+                <w:rFonts w:ascii="Arial Nova" w:hAnsi="Arial Nova" w:cs="Times New Roman"/>
+                <w:bCs/>
+                <w:szCs w:val="22"/>
+                <w:highlight w:val="yellow"/>
+              </w:rPr>
+            </w:pPr>
+            <w:r>
+              <w:rPr>
+                <w:rFonts w:ascii="Arial Nova" w:hAnsi="Arial Nova" w:cs="Times New Roman"/>
+                <w:bCs/>
+                <w:szCs w:val="22"/>
+              </w:rPr>
+              <w:t xml:space="preserve">Micro-refuge quatre saisons : plan compact d’une seule pièce</w:t>
+            </w:r>
+          </w:p>
+          <w:p>
+            <w:pPr>
+              <w:pStyle w:val="Paragraphedeliste"/>
+              <w:numPr>
+                <w:ilvl w:val="0"/>
+                <w:numId w:val="8"/>
+              </w:numPr>
+              <w:spacing w:after="120" w:line="480" w:lineRule="auto"/>
+              <w:ind w:left="346"/>
+              <w:rPr>
+                <w:rFonts w:ascii="Arial Nova" w:hAnsi="Arial Nova" w:cs="Times New Roman"/>
+                <w:bCs/>
+                <w:szCs w:val="22"/>
+              </w:rPr>
+            </w:pPr>
+            <w:r>
+              <w:rPr>
+                <w:rFonts w:ascii="Arial Nova" w:hAnsi="Arial Nova" w:cs="Times New Roman"/>
+                <w:bCs/>
+                <w:szCs w:val="22"/>
+              </w:rPr>
+              <w:t xml:space="preserve">Toiture à très forte pente : la neige glisse d’elle-même</w:t>
+            </w:r>
+          </w:p>
+          <w:p>
+            <w:pPr>
+              <w:pStyle w:val="Paragraphedeliste"/>
+              <w:numPr>
+                <w:ilvl w:val="0"/>
+                <w:numId w:val="8"/>
+              </w:numPr>
+              <w:spacing w:after="120" w:line="480" w:lineRule="auto"/>
+              <w:ind w:left="346"/>
+              <w:rPr>
+                <w:rFonts w:ascii="Arial Nova" w:hAnsi="Arial Nova" w:cs="Times New Roman"/>
+                <w:bCs/>
+                <w:szCs w:val="22"/>
+              </w:rPr>
+            </w:pPr>
+            <w:r>
+              <w:rPr>
+                <w:rFonts w:ascii="Arial Nova" w:hAnsi="Arial Nova" w:cs="Times New Roman"/>
+                <w:bCs/>
+                <w:szCs w:val="22"/>
+              </w:rPr>
+              <w:t xml:space="preserve">Implantation dispersée le long d’un sentier, dans le couvert forestier</w:t>
+            </w:r>
+          </w:p>
+          <w:p>
+            <w:pPr>
+              <w:pStyle w:val="Paragraphedeliste"/>
+              <w:numPr>
+                <w:ilvl w:val="0"/>
+                <w:numId w:val="8"/>
+              </w:numPr>
+              <w:spacing w:after="120" w:line="480" w:lineRule="auto"/>
+              <w:ind w:left="346"/>
+              <w:rPr>
+                <w:rFonts w:ascii="Arial Nova" w:hAnsi="Arial Nova" w:cs="Times New Roman"/>
+                <w:bCs/>
+                <w:szCs w:val="22"/>
+              </w:rPr>
+            </w:pPr>
+            <w:r>
+              <w:rPr>
+                <w:rFonts w:ascii="Arial Nova" w:hAnsi="Arial Nova" w:cs="Times New Roman"/>
+                <w:bCs/>
+                <w:szCs w:val="22"/>
+              </w:rPr>
+              <w:t xml:space="preserve">Ouverture concentrée sur un seul mur pignon, entièrement vitré vers le paysage</w:t>
+            </w:r>
+          </w:p>
+          <w:p>
+            <w:pPr>
+              <w:pStyle w:val="Paragraphedeliste"/>
+              <w:numPr>
+                <w:ilvl w:val="0"/>
+                <w:numId w:val="8"/>
+              </w:numPr>
+              <w:spacing w:after="120" w:line="480" w:lineRule="auto"/>
+              <w:ind w:left="346"/>
+              <w:rPr>
+                <w:rFonts w:ascii="Arial Nova" w:hAnsi="Arial Nova" w:cs="Times New Roman"/>
+                <w:bCs/>
+                <w:szCs w:val="22"/>
+              </w:rPr>
+            </w:pPr>
+            <w:r>
+              <w:rPr>
+                <w:rFonts w:ascii="Arial Nova" w:hAnsi="Arial Nova" w:cs="Times New Roman"/>
+                <w:bCs/>
+                <w:szCs w:val="22"/>
+              </w:rPr>
+              <w:t xml:space="preserve">Vocabulaire nordique dépouillé : aucun ornement, la forme fait tout le travail</w:t>
+            </w:r>
+          </w:p>
+        </w:tc>
+      </w:tr>
+      <w:tr>
+        <w:tc>
+          <w:tcPr>
+            <w:tcW w:w="8647" w:type="dxa"/>
+            <w:gridSpan w:val="2"/>
+            <w:tcBorders>
+              <w:bottom w:val="dotted" w:sz="4" w:space="0" w:color="auto"/>
+            </w:tcBorders>
+          </w:tcPr>
+          <w:p>
+            <w:pPr>
+              <w:spacing w:after="120"/>
+              <w:rPr>
+                <w:rFonts w:ascii="Arial Nova" w:hAnsi="Arial Nova" w:cs="Times New Roman"/>
+                <w:bCs/>
+                <w:sz w:val="20"/>
+              </w:rPr>
+            </w:pPr>
+            <w:r>
+              <w:rPr>
+                <w:rFonts w:ascii="Arial Nova" w:hAnsi="Arial Nova" w:cs="Times New Roman"/>
+                <w:bCs/>
+                <w:sz w:val="20"/>
+              </w:rPr>
+              <w:t xml:space="preserve">Source : www.archdaily.com/993112/farouche-tremblant-atelier-labri</w:t>
+            </w:r>
+          </w:p>
+        </w:tc>
+      </w:tr>
+      <w:tr>
+        <w:tc>
+          <w:tcPr>
+            <w:tcW w:w="8647" w:type="dxa"/>
+            <w:gridSpan w:val="2"/>
+            <w:tcBorders>
+              <w:top w:val="dotted" w:sz="4" w:space="0" w:color="auto"/>
+            </w:tcBorders>
+          </w:tcPr>
+          <w:p>
+            <w:pPr>
+              <w:spacing w:after="120" w:line="240" w:lineRule="auto"/>
+              <w:rPr>
+                <w:rFonts w:ascii="Arial Nova" w:hAnsi="Arial Nova" w:cs="Times New Roman"/>
+                <w:bCs/>
+                <w:sz w:val="20"/>
+              </w:rPr>
+            </w:pPr>
+          </w:p>
+        </w:tc>
+      </w:tr>
+      <w:tr>
+        <w:tc>
+          <w:tcPr>
+            <w:tcW w:w="4081" w:type="dxa"/>
+          </w:tcPr>
+          <w:p>
+            <w:pPr>
+              <w:spacing w:after="120" w:line="276" w:lineRule="auto"/>
+              <w:rPr>
+                <w:rFonts w:ascii="Arial Nova" w:hAnsi="Arial Nova" w:cs="Times New Roman"/>
+                <w:bCs/>
+                <w:sz w:val="24"/>
+                <w:szCs w:val="24"/>
+              </w:rPr>
+            </w:pPr>
+            <w:r>
+              <w:rPr>
+                <w:rFonts w:ascii="Arial Nova" w:hAnsi="Arial Nova" w:cs="Times New Roman"/>
+                <w:bCs/>
+                <w:i/>
+                <w:iCs/>
+                <w:color w:val="A6A6A6" w:themeColor="background1" w:themeShade="A6"/>
+                <w:sz w:val="24"/>
+                <w:szCs w:val="24"/>
+              </w:rPr>
+              <w:t>Placer votre image #</w:t>
+            </w:r>
+            <w:r>
+              <w:rPr>
+                <w:rFonts w:ascii="Arial Nova" w:hAnsi="Arial Nova" w:cs="Times New Roman"/>
+                <w:bCs/>
+                <w:i/>
+                <w:iCs/>
+                <w:color w:val="A6A6A6" w:themeColor="background1" w:themeShade="A6"/>
+                <w:sz w:val="24"/>
+                <w:szCs w:val="24"/>
+              </w:rPr>
+              <w:t>4</w:t>
+            </w:r>
+            <w:r>
+              <w:rPr>
+                <w:rFonts w:ascii="Arial Nova" w:hAnsi="Arial Nova" w:cs="Times New Roman"/>
+                <w:bCs/>
+                <w:i/>
+                <w:iCs/>
+                <w:color w:val="A6A6A6" w:themeColor="background1" w:themeShade="A6"/>
+                <w:sz w:val="24"/>
+                <w:szCs w:val="24"/>
+              </w:rPr>
+              <w:t xml:space="preserve"> ici</w:t>
+            </w:r>
+          </w:p>
+        </w:tc>
+        <w:tc>
+          <w:tcPr>
+            <w:tcW w:w="4566" w:type="dxa"/>
+            <w:vAlign w:val="center"/>
+          </w:tcPr>
+          <w:p>
+            <w:pPr>
+              <w:pStyle w:val="Paragraphedeliste"/>
+              <w:numPr>
+                <w:ilvl w:val="0"/>
+                <w:numId w:val="8"/>
+              </w:numPr>
+              <w:spacing w:after="120" w:line="480" w:lineRule="auto"/>
+              <w:ind w:left="346"/>
+              <w:rPr>
+                <w:rFonts w:ascii="Arial Nova" w:hAnsi="Arial Nova" w:cs="Times New Roman"/>
+                <w:bCs/>
+                <w:szCs w:val="22"/>
+                <w:highlight w:val="yellow"/>
+              </w:rPr>
+            </w:pPr>
+            <w:r>
+              <w:rPr>
+                <w:rFonts w:ascii="Arial Nova" w:hAnsi="Arial Nova" w:cs="Times New Roman"/>
+                <w:bCs/>
+                <w:szCs w:val="22"/>
+              </w:rPr>
+              <w:t xml:space="preserve">Mobilier intégré : banquette, rangements bas, tablettes en continu</w:t>
+            </w:r>
+          </w:p>
+          <w:p>
+            <w:pPr>
+              <w:pStyle w:val="Paragraphedeliste"/>
+              <w:numPr>
+                <w:ilvl w:val="0"/>
+                <w:numId w:val="8"/>
+              </w:numPr>
+              <w:spacing w:after="120" w:line="480" w:lineRule="auto"/>
+              <w:ind w:left="346"/>
+              <w:rPr>
+                <w:rFonts w:ascii="Arial Nova" w:hAnsi="Arial Nova" w:cs="Times New Roman"/>
+                <w:bCs/>
+                <w:szCs w:val="22"/>
+              </w:rPr>
+            </w:pPr>
+            <w:r>
+              <w:rPr>
+                <w:rFonts w:ascii="Arial Nova" w:hAnsi="Arial Nova" w:cs="Times New Roman"/>
+                <w:bCs/>
+                <w:szCs w:val="22"/>
+              </w:rPr>
+              <w:t xml:space="preserve">Terrasse couverte sous le débord de toit : pièce extérieure utilisable par mauvais temps</w:t>
+            </w:r>
+          </w:p>
+          <w:p>
+            <w:pPr>
+              <w:pStyle w:val="Paragraphedeliste"/>
+              <w:numPr>
+                <w:ilvl w:val="0"/>
+                <w:numId w:val="8"/>
+              </w:numPr>
+              <w:spacing w:after="120" w:line="480" w:lineRule="auto"/>
+              <w:ind w:left="346"/>
+              <w:rPr>
+                <w:rFonts w:ascii="Arial Nova" w:hAnsi="Arial Nova" w:cs="Times New Roman"/>
+                <w:bCs/>
+                <w:szCs w:val="22"/>
+              </w:rPr>
+            </w:pPr>
+            <w:r>
+              <w:rPr>
+                <w:rFonts w:ascii="Arial Nova" w:hAnsi="Arial Nova" w:cs="Times New Roman"/>
+                <w:bCs/>
+                <w:szCs w:val="22"/>
+              </w:rPr>
+              <w:t xml:space="preserve">Toiture monopente : volume simple, écoulement d’un seul côté</w:t>
+            </w:r>
+          </w:p>
+          <w:p>
+            <w:pPr>
+              <w:pStyle w:val="Paragraphedeliste"/>
+              <w:numPr>
+                <w:ilvl w:val="0"/>
+                <w:numId w:val="8"/>
+              </w:numPr>
+              <w:spacing w:after="120" w:line="480" w:lineRule="auto"/>
+              <w:ind w:left="346"/>
+              <w:rPr>
+                <w:rFonts w:ascii="Arial Nova" w:hAnsi="Arial Nova" w:cs="Times New Roman"/>
+                <w:bCs/>
+                <w:szCs w:val="22"/>
+              </w:rPr>
+            </w:pPr>
+            <w:r>
+              <w:rPr>
+                <w:rFonts w:ascii="Arial Nova" w:hAnsi="Arial Nova" w:cs="Times New Roman"/>
+                <w:bCs/>
+                <w:szCs w:val="22"/>
+              </w:rPr>
+              <w:t xml:space="preserve">Revêtement métallique clair, sans entretien</w:t>
+            </w:r>
+          </w:p>
+          <w:p>
+            <w:pPr>
+              <w:pStyle w:val="Paragraphedeliste"/>
+              <w:numPr>
+                <w:ilvl w:val="0"/>
+                <w:numId w:val="8"/>
+              </w:numPr>
+              <w:spacing w:after="120" w:line="480" w:lineRule="auto"/>
+              <w:ind w:left="346"/>
+              <w:rPr>
+                <w:rFonts w:ascii="Arial Nova" w:hAnsi="Arial Nova" w:cs="Times New Roman"/>
+                <w:bCs/>
+                <w:szCs w:val="22"/>
+              </w:rPr>
+            </w:pPr>
+            <w:r>
+              <w:rPr>
+                <w:rFonts w:ascii="Arial Nova" w:hAnsi="Arial Nova" w:cs="Times New Roman"/>
+                <w:bCs/>
+                <w:szCs w:val="22"/>
+              </w:rPr>
+              <w:t xml:space="preserve">Fenêtres qui cadrent des vues précises plutôt que d’ouvrir tout le mur</w:t>
+            </w:r>
+          </w:p>
+        </w:tc>
+      </w:tr>
+      <w:tr>
+        <w:tc>
+          <w:tcPr>
+            <w:tcW w:w="8647" w:type="dxa"/>
+            <w:gridSpan w:val="2"/>
+          </w:tcPr>
+          <w:p>
+            <w:pPr>
+              <w:spacing w:after="120"/>
+              <w:rPr>
+                <w:rFonts w:ascii="Arial Nova" w:hAnsi="Arial Nova" w:cs="Times New Roman"/>
+                <w:bCs/>
+                <w:sz w:val="20"/>
+              </w:rPr>
+            </w:pPr>
+            <w:r>
+              <w:rPr>
+                <w:rFonts w:ascii="Arial Nova" w:hAnsi="Arial Nova" w:cs="Times New Roman"/>
+                <w:bCs/>
+                <w:sz w:val="20"/>
+              </w:rPr>
+              <w:t xml:space="preserve">Source : www.archdaily.com/1012890/kanata-cabin-atelier-labri</w:t>
+            </w:r>
+          </w:p>
+        </w:tc>
+      </w:tr>
+    </w:tbl>
+    <w:p>
+      <w:pPr>
+        <w:spacing w:after="120"/>
+        <w:rPr>
+          <w:rFonts w:ascii="Arial Nova" w:hAnsi="Arial Nova" w:cs="Times New Roman"/>
+          <w:bCs/>
+          <w:sz w:val="20"/>
+        </w:rPr>
+      </w:pPr>
+      <w:r>
+        <w:rPr>
+          <w:rFonts w:ascii="Arial Nova" w:hAnsi="Arial Nova" w:cs="Times New Roman"/>
+          <w:bCs/>
+          <w:sz w:val="20"/>
+        </w:rPr>
+        <w:t xml:space="preserve">Nombre de mots : 220</w:t>
+      </w:r>
+    </w:p>
+    <w:p>
+      <w:pPr>
+        <w:spacing w:after="160" w:line="259" w:lineRule="auto"/>
+        <w:rPr>
+          <w:rFonts w:ascii="Times New Roman" w:hAnsi="Times New Roman" w:cs="Times New Roman"/>
+          <w:bCs/>
+          <w:i/>
+          <w:iCs/>
+          <w:color w:val="A6A6A6" w:themeColor="background1" w:themeShade="A6"/>
+          <w:sz w:val="32"/>
+          <w:szCs w:val="32"/>
+          <w:u w:val="single"/>
+        </w:rPr>
+      </w:pPr>
+    </w:p>
+    <w:p>
+      <w:pPr>
+        <w:spacing w:after="160" w:line="259" w:lineRule="auto"/>
+        <w:rPr>
+          <w:rFonts w:ascii="Times New Roman" w:hAnsi="Times New Roman" w:cs="Times New Roman"/>
+          <w:bCs/>
+          <w:i/>
+          <w:iCs/>
+          <w:color w:val="A6A6A6" w:themeColor="background1" w:themeShade="A6"/>
+          <w:sz w:val="32"/>
+          <w:szCs w:val="32"/>
+          <w:u w:val="single"/>
+        </w:rPr>
+      </w:pPr>
+    </w:p>
+    <w:p>
+      <w:pPr>
+        <w:spacing w:after="160" w:line="259" w:lineRule="auto"/>
+        <w:rPr>
+          <w:rFonts w:ascii="Times New Roman" w:hAnsi="Times New Roman" w:cs="Times New Roman"/>
+          <w:bCs/>
+          <w:i/>
+          <w:iCs/>
+          <w:color w:val="A6A6A6" w:themeColor="background1" w:themeShade="A6"/>
+          <w:sz w:val="32"/>
+          <w:szCs w:val="32"/>
+          <w:u w:val="single"/>
+        </w:rPr>
+      </w:pPr>
+      <w:r>
+        <w:rPr>
+          <w:rFonts w:ascii="Times New Roman" w:hAnsi="Times New Roman" w:cs="Times New Roman"/>
+          <w:bCs/>
+          <w:i/>
+          <w:iCs/>
+          <w:color w:val="A6A6A6" w:themeColor="background1" w:themeShade="A6"/>
+          <w:sz w:val="32"/>
+          <w:szCs w:val="32"/>
+          <w:u w:val="single"/>
+        </w:rPr>
+        <w:br w:type="page"/>
+      </w:r>
+    </w:p>
+    <w:p>
+      <w:pPr>
+        <w:jc w:val="both"/>
+        <w:rPr>
+          <w:rFonts w:ascii="Times New Roman" w:hAnsi="Times New Roman" w:cs="Times New Roman"/>
+          <w:bCs/>
+          <w:i/>
+          <w:iCs/>
+          <w:color w:val="A6A6A6" w:themeColor="background1" w:themeShade="A6"/>
+          <w:sz w:val="32"/>
+          <w:szCs w:val="32"/>
+        </w:rPr>
+      </w:pPr>
+      <w:r>
+        <w:rPr>
+          <w:rFonts w:ascii="Times New Roman" w:hAnsi="Times New Roman" w:cs="Times New Roman"/>
+          <w:bCs/>
+          <w:i/>
+          <w:iCs/>
+          <w:color w:val="A6A6A6" w:themeColor="background1" w:themeShade="A6"/>
+          <w:sz w:val="32"/>
+          <w:szCs w:val="32"/>
+          <w:u w:val="single"/>
+        </w:rPr>
+        <w:lastRenderedPageBreak/>
+        <w:t>Instructions</w:t>
+      </w:r>
+      <w:r>
+        <w:rPr>
+          <w:rFonts w:ascii="Times New Roman" w:hAnsi="Times New Roman" w:cs="Times New Roman"/>
+          <w:bCs/>
+          <w:i/>
+          <w:iCs/>
+          <w:color w:val="A6A6A6" w:themeColor="background1" w:themeShade="A6"/>
+          <w:sz w:val="32"/>
+          <w:szCs w:val="32"/>
+        </w:rPr>
+        <w:t xml:space="preserve"> : </w:t>
+      </w:r>
+    </w:p>
+    <w:p>
+      <w:pPr>
+        <w:pStyle w:val="Paragraphedeliste"/>
+        <w:numPr>
+          <w:ilvl w:val="0"/>
+          <w:numId w:val="7"/>
+        </w:numPr>
+        <w:jc w:val="both"/>
+        <w:rPr>
+          <w:rFonts w:ascii="Times New Roman" w:hAnsi="Times New Roman" w:cs="Times New Roman"/>
+          <w:bCs/>
+          <w:i/>
+          <w:iCs/>
+          <w:color w:val="A6A6A6" w:themeColor="background1" w:themeShade="A6"/>
+          <w:sz w:val="32"/>
+          <w:szCs w:val="32"/>
+        </w:rPr>
+      </w:pPr>
+      <w:r>
+        <w:rPr>
+          <w:rFonts w:ascii="Times New Roman" w:hAnsi="Times New Roman" w:cs="Times New Roman"/>
+          <w:bCs/>
+          <w:i/>
+          <w:iCs/>
+          <w:color w:val="A6A6A6" w:themeColor="background1" w:themeShade="A6"/>
+          <w:sz w:val="32"/>
+          <w:szCs w:val="32"/>
+        </w:rPr>
+        <w:t>Vous pouvez personnaliser le gabarit si vous le souhaitez (</w:t>
+      </w:r>
+      <w:r>
+        <w:rPr>
+          <w:rFonts w:ascii="Times New Roman" w:hAnsi="Times New Roman" w:cs="Times New Roman"/>
+          <w:bCs/>
+          <w:i/>
+          <w:iCs/>
+          <w:color w:val="A6A6A6" w:themeColor="background1" w:themeShade="A6"/>
+          <w:sz w:val="32"/>
+          <w:szCs w:val="32"/>
+        </w:rPr>
+        <w:t xml:space="preserve">la </w:t>
+      </w:r>
+      <w:r>
+        <w:rPr>
+          <w:rFonts w:ascii="Times New Roman" w:hAnsi="Times New Roman" w:cs="Times New Roman"/>
+          <w:bCs/>
+          <w:i/>
+          <w:iCs/>
+          <w:color w:val="A6A6A6" w:themeColor="background1" w:themeShade="A6"/>
+          <w:sz w:val="32"/>
+          <w:szCs w:val="32"/>
+        </w:rPr>
+        <w:t>police de text</w:t>
+      </w:r>
+      <w:r>
+        <w:rPr>
+          <w:rFonts w:ascii="Times New Roman" w:hAnsi="Times New Roman" w:cs="Times New Roman"/>
+          <w:bCs/>
+          <w:i/>
+          <w:iCs/>
+          <w:color w:val="A6A6A6" w:themeColor="background1" w:themeShade="A6"/>
+          <w:sz w:val="32"/>
+          <w:szCs w:val="32"/>
+        </w:rPr>
+        <w:t>e, par exemple</w:t>
+      </w:r>
+      <w:r>
+        <w:rPr>
+          <w:rFonts w:ascii="Times New Roman" w:hAnsi="Times New Roman" w:cs="Times New Roman"/>
+          <w:bCs/>
+          <w:i/>
+          <w:iCs/>
+          <w:color w:val="A6A6A6" w:themeColor="background1" w:themeShade="A6"/>
+          <w:sz w:val="32"/>
+          <w:szCs w:val="32"/>
+        </w:rPr>
+        <w:t>)</w:t>
+      </w:r>
+      <w:r>
+        <w:rPr>
+          <w:rFonts w:ascii="Times New Roman" w:hAnsi="Times New Roman" w:cs="Times New Roman"/>
+          <w:bCs/>
+          <w:i/>
+          <w:iCs/>
+          <w:color w:val="A6A6A6" w:themeColor="background1" w:themeShade="A6"/>
+          <w:sz w:val="32"/>
+          <w:szCs w:val="32"/>
+        </w:rPr>
+        <w:t>.</w:t>
+      </w:r>
+    </w:p>
+    <w:p>
+      <w:pPr>
+        <w:pStyle w:val="Paragraphedeliste"/>
+        <w:numPr>
+          <w:ilvl w:val="0"/>
+          <w:numId w:val="7"/>
+        </w:numPr>
+        <w:jc w:val="both"/>
+        <w:rPr>
+          <w:rFonts w:ascii="Times New Roman" w:hAnsi="Times New Roman" w:cs="Times New Roman"/>
+          <w:bCs/>
+          <w:i/>
+          <w:iCs/>
+          <w:color w:val="A6A6A6" w:themeColor="background1" w:themeShade="A6"/>
+          <w:sz w:val="32"/>
+          <w:szCs w:val="32"/>
+        </w:rPr>
+      </w:pPr>
+      <w:r>
+        <w:rPr>
+          <w:rFonts w:ascii="Times New Roman" w:hAnsi="Times New Roman" w:cs="Times New Roman"/>
+          <w:bCs/>
+          <w:i/>
+          <w:iCs/>
+          <w:color w:val="A6A6A6" w:themeColor="background1" w:themeShade="A6"/>
+          <w:sz w:val="32"/>
+          <w:szCs w:val="32"/>
+        </w:rPr>
+        <w:t xml:space="preserve">Soignez la présentation : </w:t>
+      </w:r>
+      <w:r>
+        <w:rPr>
+          <w:rFonts w:ascii="Times New Roman" w:hAnsi="Times New Roman" w:cs="Times New Roman"/>
+          <w:bCs/>
+          <w:i/>
+          <w:iCs/>
+          <w:color w:val="A6A6A6" w:themeColor="background1" w:themeShade="A6"/>
+          <w:sz w:val="32"/>
+          <w:szCs w:val="32"/>
+        </w:rPr>
+        <w:t>les images doivent être de taille similaire, alignées, pas trop petites ni trop grosses</w:t>
+      </w:r>
+      <w:r>
+        <w:rPr>
+          <w:rFonts w:ascii="Times New Roman" w:hAnsi="Times New Roman" w:cs="Times New Roman"/>
+          <w:bCs/>
+          <w:i/>
+          <w:iCs/>
+          <w:color w:val="A6A6A6" w:themeColor="background1" w:themeShade="A6"/>
+          <w:sz w:val="32"/>
+          <w:szCs w:val="32"/>
+        </w:rPr>
+        <w:t xml:space="preserve"> (2 ou 3 par page)</w:t>
+      </w:r>
+      <w:r>
+        <w:rPr>
+          <w:rFonts w:ascii="Times New Roman" w:hAnsi="Times New Roman" w:cs="Times New Roman"/>
+          <w:bCs/>
+          <w:i/>
+          <w:iCs/>
+          <w:color w:val="A6A6A6" w:themeColor="background1" w:themeShade="A6"/>
+          <w:sz w:val="32"/>
+          <w:szCs w:val="32"/>
+        </w:rPr>
+        <w:t>.</w:t>
+      </w:r>
+    </w:p>
+    <w:p>
+      <w:pPr>
+        <w:pStyle w:val="Paragraphedeliste"/>
+        <w:numPr>
+          <w:ilvl w:val="0"/>
+          <w:numId w:val="7"/>
+        </w:numPr>
+        <w:jc w:val="both"/>
+        <w:rPr>
+          <w:rFonts w:ascii="Times New Roman" w:hAnsi="Times New Roman" w:cs="Times New Roman"/>
+          <w:bCs/>
+          <w:i/>
+          <w:iCs/>
+          <w:color w:val="A6A6A6" w:themeColor="background1" w:themeShade="A6"/>
+          <w:sz w:val="32"/>
+          <w:szCs w:val="32"/>
+        </w:rPr>
+      </w:pPr>
+      <w:r>
+        <w:rPr>
+          <w:rFonts w:ascii="Times New Roman" w:hAnsi="Times New Roman" w:cs="Times New Roman"/>
+          <w:bCs/>
+          <w:i/>
+          <w:iCs/>
+          <w:color w:val="A6A6A6" w:themeColor="background1" w:themeShade="A6"/>
+          <w:sz w:val="32"/>
+          <w:szCs w:val="32"/>
+        </w:rPr>
+        <w:t>N</w:t>
+      </w:r>
+      <w:r>
+        <w:rPr>
+          <w:rFonts w:ascii="Times New Roman" w:hAnsi="Times New Roman" w:cs="Times New Roman"/>
+          <w:bCs/>
+          <w:i/>
+          <w:iCs/>
+          <w:color w:val="A6A6A6" w:themeColor="background1" w:themeShade="A6"/>
+          <w:sz w:val="32"/>
+          <w:szCs w:val="32"/>
+        </w:rPr>
+        <w:t xml:space="preserve">’oubliez pas d’effacer tout le texte en gris </w:t>
+      </w:r>
+      <w:r>
+        <w:rPr>
+          <w:rFonts w:ascii="Times New Roman" w:hAnsi="Times New Roman" w:cs="Times New Roman"/>
+          <w:bCs/>
+          <w:i/>
+          <w:iCs/>
+          <w:color w:val="A6A6A6" w:themeColor="background1" w:themeShade="A6"/>
+          <w:sz w:val="32"/>
+          <w:szCs w:val="32"/>
+        </w:rPr>
+        <w:t xml:space="preserve">et d’enlever le surlignage jaune </w:t>
+      </w:r>
+      <w:r>
+        <w:rPr>
+          <w:rFonts w:ascii="Times New Roman" w:hAnsi="Times New Roman" w:cs="Times New Roman"/>
+          <w:bCs/>
+          <w:i/>
+          <w:iCs/>
+          <w:color w:val="A6A6A6" w:themeColor="background1" w:themeShade="A6"/>
+          <w:sz w:val="32"/>
+          <w:szCs w:val="32"/>
+        </w:rPr>
+        <w:t>avant d’imprimer!!!</w:t>
+      </w:r>
+      <w:r>
+        <w:rPr>
+          <w:rFonts w:ascii="Times New Roman" w:hAnsi="Times New Roman" w:cs="Times New Roman"/>
+          <w:bCs/>
+          <w:i/>
+          <w:iCs/>
+          <w:color w:val="A6A6A6" w:themeColor="background1" w:themeShade="A6"/>
+          <w:sz w:val="32"/>
+          <w:szCs w:val="32"/>
+        </w:rPr>
+        <w:t xml:space="preserve"> </w:t>
+      </w:r>
+    </w:p>
+    <w:p>
+      <w:pPr>
+        <w:pStyle w:val="Paragraphedeliste"/>
+        <w:numPr>
+          <w:ilvl w:val="0"/>
+          <w:numId w:val="7"/>
+        </w:numPr>
+        <w:jc w:val="both"/>
+        <w:rPr>
+          <w:rFonts w:ascii="Times New Roman" w:hAnsi="Times New Roman" w:cs="Times New Roman"/>
+          <w:bCs/>
+          <w:i/>
+          <w:iCs/>
+          <w:color w:val="A6A6A6" w:themeColor="background1" w:themeShade="A6"/>
+          <w:sz w:val="32"/>
+          <w:szCs w:val="32"/>
+        </w:rPr>
+      </w:pPr>
+      <w:r>
+        <w:rPr>
+          <w:rFonts w:ascii="Times New Roman" w:hAnsi="Times New Roman" w:cs="Times New Roman"/>
+          <w:bCs/>
+          <w:i/>
+          <w:iCs/>
+          <w:color w:val="A6A6A6" w:themeColor="background1" w:themeShade="A6"/>
+          <w:sz w:val="32"/>
+          <w:szCs w:val="32"/>
+        </w:rPr>
+        <w:t>Rappel : imprimer en recto seulement (insérer des pages blanches</w:t>
+      </w:r>
+      <w:r>
+        <w:rPr>
+          <w:rFonts w:ascii="Times New Roman" w:hAnsi="Times New Roman" w:cs="Times New Roman"/>
+          <w:bCs/>
+          <w:i/>
+          <w:iCs/>
+          <w:color w:val="A6A6A6" w:themeColor="background1" w:themeShade="A6"/>
+          <w:sz w:val="32"/>
+          <w:szCs w:val="32"/>
+        </w:rPr>
+        <w:t xml:space="preserve"> au besoin).</w:t>
+      </w:r>
+    </w:p>
+    <w:p>
+      <w:pPr>
+        <w:spacing w:after="180" w:line="276" w:lineRule="auto"/>
+        <w:rPr>
+          <w:rFonts w:ascii="Times New Roman" w:hAnsi="Times New Roman" w:cs="Times New Roman"/>
+          <w:b/>
+          <w:sz w:val="28"/>
+          <w:szCs w:val="28"/>
+        </w:rPr>
+      </w:pPr>
+    </w:p>
+    <w:p>
+      <w:pPr>
+        <w:spacing w:after="160" w:line="259" w:lineRule="auto"/>
+        <w:rPr>
+          <w:rFonts w:ascii="Times New Roman" w:hAnsi="Times New Roman" w:cs="Times New Roman"/>
+          <w:b/>
+          <w:sz w:val="28"/>
+          <w:szCs w:val="28"/>
+        </w:rPr>
+      </w:pPr>
+    </w:p>
+    <w:sectPr>
+      <w:pgSz w:w="12240" w:h="15840"/>
+      <w:pgMar w:top="1440" w:right="1800" w:bottom="1440" w:left="1800" w:header="709" w:footer="130" w:gutter="0"/>
+      <w:cols w:space="708"/>
+      <w:docGrid w:linePitch="360"/>
+    </w:sectPr>
+  </w:body>
+</w:document>
 </file>
 
 <file path=word/endnotes.xml><?xml version="1.0" encoding="utf-8"?>

</xml_diff>